<commit_message>
Manual: rewrite chapters 2-3 for the installer versions
</commit_message>
<xml_diff>
--- a/manual/METEORAD_Manual_en.docx
+++ b/manual/METEORAD_Manual_en.docx
@@ -212,7 +212,7 @@
             <w:instrText xml:space="preserve">TOC \h \o "1-2"</w:instrText>
             <w:fldChar w:fldCharType="separate"/>
           </w:r>
-          <w:hyperlink w:history="1" w:anchor="_Toc38">
+          <w:hyperlink w:history="1" w:anchor="_Toc42">
             <w:r>
               <w:t xml:space="preserve">1. Overview</w:t>
             </w:r>
@@ -221,7 +221,7 @@
             </w:r>
             <w:r>
               <w:fldChar w:fldCharType="begin" w:dirty="true"/>
-              <w:instrText xml:space="preserve">PAGEREF _Toc38 \h</w:instrText>
+              <w:instrText xml:space="preserve">PAGEREF _Toc42 \h</w:instrText>
               <w:fldChar w:fldCharType="separate"/>
               <w:fldChar w:fldCharType="end"/>
             </w:r>
@@ -234,7 +234,7 @@
               <w:tab w:val="right" w:pos="9638" w:leader="dot"/>
             </w:tabs>
           </w:pPr>
-          <w:hyperlink w:history="1" w:anchor="_Toc39">
+          <w:hyperlink w:history="1" w:anchor="_Toc43">
             <w:r>
               <w:t xml:space="preserve">1.1 Applications</w:t>
             </w:r>
@@ -243,7 +243,7 @@
             </w:r>
             <w:r>
               <w:fldChar w:fldCharType="begin" w:dirty="true"/>
-              <w:instrText xml:space="preserve">PAGEREF _Toc39 \h</w:instrText>
+              <w:instrText xml:space="preserve">PAGEREF _Toc43 \h</w:instrText>
               <w:fldChar w:fldCharType="separate"/>
               <w:fldChar w:fldCharType="end"/>
             </w:r>
@@ -256,7 +256,7 @@
               <w:tab w:val="right" w:pos="9638" w:leader="dot"/>
             </w:tabs>
           </w:pPr>
-          <w:hyperlink w:history="1" w:anchor="_Toc40">
+          <w:hyperlink w:history="1" w:anchor="_Toc44">
             <w:r>
               <w:t xml:space="preserve">1.2 Main features</w:t>
             </w:r>
@@ -265,7 +265,7 @@
             </w:r>
             <w:r>
               <w:fldChar w:fldCharType="begin" w:dirty="true"/>
-              <w:instrText xml:space="preserve">PAGEREF _Toc40 \h</w:instrText>
+              <w:instrText xml:space="preserve">PAGEREF _Toc44 \h</w:instrText>
               <w:fldChar w:fldCharType="separate"/>
               <w:fldChar w:fldCharType="end"/>
             </w:r>
@@ -278,97 +278,9 @@
               <w:tab w:val="right" w:pos="9638" w:leader="dot"/>
             </w:tabs>
           </w:pPr>
-          <w:hyperlink w:history="1" w:anchor="_Toc41">
+          <w:hyperlink w:history="1" w:anchor="_Toc45">
             <w:r>
               <w:t xml:space="preserve">1.3 Verification</w:t>
-            </w:r>
-            <w:r>
-              <w:tab/>
-            </w:r>
-            <w:r>
-              <w:fldChar w:fldCharType="begin" w:dirty="true"/>
-              <w:instrText xml:space="preserve">PAGEREF _Toc41 \h</w:instrText>
-              <w:fldChar w:fldCharType="separate"/>
-              <w:fldChar w:fldCharType="end"/>
-            </w:r>
-          </w:hyperlink>
-        </w:p>
-        <w:p>
-          <w:pPr>
-            <w:pStyle w:val="TOC2"/>
-            <w:tabs>
-              <w:tab w:val="right" w:pos="9638" w:leader="dot"/>
-            </w:tabs>
-          </w:pPr>
-          <w:hyperlink w:history="1" w:anchor="_Toc42">
-            <w:r>
-              <w:t xml:space="preserve">1.4 Citation (required)</w:t>
-            </w:r>
-            <w:r>
-              <w:tab/>
-            </w:r>
-            <w:r>
-              <w:fldChar w:fldCharType="begin" w:dirty="true"/>
-              <w:instrText xml:space="preserve">PAGEREF _Toc42 \h</w:instrText>
-              <w:fldChar w:fldCharType="separate"/>
-              <w:fldChar w:fldCharType="end"/>
-            </w:r>
-          </w:hyperlink>
-        </w:p>
-        <w:p>
-          <w:pPr>
-            <w:pStyle w:val="TOC1"/>
-            <w:tabs>
-              <w:tab w:val="right" w:pos="9638" w:leader="dot"/>
-            </w:tabs>
-          </w:pPr>
-          <w:hyperlink w:history="1" w:anchor="_Toc43">
-            <w:r>
-              <w:t xml:space="preserve">2. Requirements and installation</w:t>
-            </w:r>
-            <w:r>
-              <w:tab/>
-            </w:r>
-            <w:r>
-              <w:fldChar w:fldCharType="begin" w:dirty="true"/>
-              <w:instrText xml:space="preserve">PAGEREF _Toc43 \h</w:instrText>
-              <w:fldChar w:fldCharType="separate"/>
-              <w:fldChar w:fldCharType="end"/>
-            </w:r>
-          </w:hyperlink>
-        </w:p>
-        <w:p>
-          <w:pPr>
-            <w:pStyle w:val="TOC1"/>
-            <w:tabs>
-              <w:tab w:val="right" w:pos="9638" w:leader="dot"/>
-            </w:tabs>
-          </w:pPr>
-          <w:hyperlink w:history="1" w:anchor="_Toc44">
-            <w:r>
-              <w:t xml:space="preserve">3. Start-up and window layout</w:t>
-            </w:r>
-            <w:r>
-              <w:tab/>
-            </w:r>
-            <w:r>
-              <w:fldChar w:fldCharType="begin" w:dirty="true"/>
-              <w:instrText xml:space="preserve">PAGEREF _Toc44 \h</w:instrText>
-              <w:fldChar w:fldCharType="separate"/>
-              <w:fldChar w:fldCharType="end"/>
-            </w:r>
-          </w:hyperlink>
-        </w:p>
-        <w:p>
-          <w:pPr>
-            <w:pStyle w:val="TOC1"/>
-            <w:tabs>
-              <w:tab w:val="right" w:pos="9638" w:leader="dot"/>
-            </w:tabs>
-          </w:pPr>
-          <w:hyperlink w:history="1" w:anchor="_Toc45">
-            <w:r>
-              <w:t xml:space="preserve">4. Species panel</w:t>
             </w:r>
             <w:r>
               <w:tab/>
@@ -390,7 +302,7 @@
           </w:pPr>
           <w:hyperlink w:history="1" w:anchor="_Toc46">
             <w:r>
-              <w:t xml:space="preserve">4.1 Presets</w:t>
+              <w:t xml:space="preserve">1.4 Citation (required)</w:t>
             </w:r>
             <w:r>
               <w:tab/>
@@ -412,7 +324,7 @@
           </w:pPr>
           <w:hyperlink w:history="1" w:anchor="_Toc47">
             <w:r>
-              <w:t xml:space="preserve">5. Parameter panel</w:t>
+              <w:t xml:space="preserve">2. Requirements and installation</w:t>
             </w:r>
             <w:r>
               <w:tab/>
@@ -434,7 +346,7 @@
           </w:pPr>
           <w:hyperlink w:history="1" w:anchor="_Toc48">
             <w:r>
-              <w:t xml:space="preserve">5.1 Automatic pressure FWHM (Auto)</w:t>
+              <w:t xml:space="preserve">2.1 Windows</w:t>
             </w:r>
             <w:r>
               <w:tab/>
@@ -449,14 +361,14 @@
         </w:p>
         <w:p>
           <w:pPr>
-            <w:pStyle w:val="TOC1"/>
+            <w:pStyle w:val="TOC2"/>
             <w:tabs>
               <w:tab w:val="right" w:pos="9638" w:leader="dot"/>
             </w:tabs>
           </w:pPr>
           <w:hyperlink w:history="1" w:anchor="_Toc49">
             <w:r>
-              <w:t xml:space="preserve">6. Running and displaying spectra</w:t>
+              <w:t xml:space="preserve">2.2 macOS</w:t>
             </w:r>
             <w:r>
               <w:tab/>
@@ -478,7 +390,7 @@
           </w:pPr>
           <w:hyperlink w:history="1" w:anchor="_Toc50">
             <w:r>
-              <w:t xml:space="preserve">6.1 Basic procedure</w:t>
+              <w:t xml:space="preserve">2.3 Where the databases are stored</w:t>
             </w:r>
             <w:r>
               <w:tab/>
@@ -500,7 +412,7 @@
           </w:pPr>
           <w:hyperlink w:history="1" w:anchor="_Toc51">
             <w:r>
-              <w:t xml:space="preserve">6.2 Plot-panel controls</w:t>
+              <w:t xml:space="preserve">2.4 Uninstalling</w:t>
             </w:r>
             <w:r>
               <w:tab/>
@@ -515,14 +427,14 @@
         </w:p>
         <w:p>
           <w:pPr>
-            <w:pStyle w:val="TOC2"/>
+            <w:pStyle w:val="TOC1"/>
             <w:tabs>
               <w:tab w:val="right" w:pos="9638" w:leader="dot"/>
             </w:tabs>
           </w:pPr>
           <w:hyperlink w:history="1" w:anchor="_Toc52">
             <w:r>
-              <w:t xml:space="preserve">6.3 Slab intensity</w:t>
+              <w:t xml:space="preserve">3. Start-up and window layout</w:t>
             </w:r>
             <w:r>
               <w:tab/>
@@ -544,7 +456,7 @@
           </w:pPr>
           <w:hyperlink w:history="1" w:anchor="_Toc53">
             <w:r>
-              <w:t xml:space="preserve">7. Menus</w:t>
+              <w:t xml:space="preserve">4. Species panel</w:t>
             </w:r>
             <w:r>
               <w:tab/>
@@ -566,7 +478,7 @@
           </w:pPr>
           <w:hyperlink w:history="1" w:anchor="_Toc54">
             <w:r>
-              <w:t xml:space="preserve">7.1 Spectrum file format</w:t>
+              <w:t xml:space="preserve">4.1 Presets</w:t>
             </w:r>
             <w:r>
               <w:tab/>
@@ -588,7 +500,7 @@
           </w:pPr>
           <w:hyperlink w:history="1" w:anchor="_Toc55">
             <w:r>
-              <w:t xml:space="preserve">8. Temperature sweep</w:t>
+              <w:t xml:space="preserve">5. Parameter panel</w:t>
             </w:r>
             <w:r>
               <w:tab/>
@@ -596,6 +508,28 @@
             <w:r>
               <w:fldChar w:fldCharType="begin" w:dirty="true"/>
               <w:instrText xml:space="preserve">PAGEREF _Toc55 \h</w:instrText>
+              <w:fldChar w:fldCharType="separate"/>
+              <w:fldChar w:fldCharType="end"/>
+            </w:r>
+          </w:hyperlink>
+        </w:p>
+        <w:p>
+          <w:pPr>
+            <w:pStyle w:val="TOC2"/>
+            <w:tabs>
+              <w:tab w:val="right" w:pos="9638" w:leader="dot"/>
+            </w:tabs>
+          </w:pPr>
+          <w:hyperlink w:history="1" w:anchor="_Toc56">
+            <w:r>
+              <w:t xml:space="preserve">5.1 Automatic pressure FWHM (Auto)</w:t>
+            </w:r>
+            <w:r>
+              <w:tab/>
+            </w:r>
+            <w:r>
+              <w:fldChar w:fldCharType="begin" w:dirty="true"/>
+              <w:instrText xml:space="preserve">PAGEREF _Toc56 \h</w:instrText>
               <w:fldChar w:fldCharType="separate"/>
               <w:fldChar w:fldCharType="end"/>
             </w:r>
@@ -608,31 +542,9 @@
               <w:tab w:val="right" w:pos="9638" w:leader="dot"/>
             </w:tabs>
           </w:pPr>
-          <w:hyperlink w:history="1" w:anchor="_Toc56">
-            <w:r>
-              <w:t xml:space="preserve">9. Fitting an observed spectrum</w:t>
-            </w:r>
-            <w:r>
-              <w:tab/>
-            </w:r>
-            <w:r>
-              <w:fldChar w:fldCharType="begin" w:dirty="true"/>
-              <w:instrText xml:space="preserve">PAGEREF _Toc56 \h</w:instrText>
-              <w:fldChar w:fldCharType="separate"/>
-              <w:fldChar w:fldCharType="end"/>
-            </w:r>
-          </w:hyperlink>
-        </w:p>
-        <w:p>
-          <w:pPr>
-            <w:pStyle w:val="TOC2"/>
-            <w:tabs>
-              <w:tab w:val="right" w:pos="9638" w:leader="dot"/>
-            </w:tabs>
-          </w:pPr>
           <w:hyperlink w:history="1" w:anchor="_Toc57">
             <w:r>
-              <w:t xml:space="preserve">9.1 Settings</w:t>
+              <w:t xml:space="preserve">6. Running and displaying spectra</w:t>
             </w:r>
             <w:r>
               <w:tab/>
@@ -654,7 +566,7 @@
           </w:pPr>
           <w:hyperlink w:history="1" w:anchor="_Toc58">
             <w:r>
-              <w:t xml:space="preserve">9.2 Search method</w:t>
+              <w:t xml:space="preserve">6.1 Basic procedure</w:t>
             </w:r>
             <w:r>
               <w:tab/>
@@ -669,14 +581,14 @@
         </w:p>
         <w:p>
           <w:pPr>
-            <w:pStyle w:val="TOC1"/>
+            <w:pStyle w:val="TOC2"/>
             <w:tabs>
               <w:tab w:val="right" w:pos="9638" w:leader="dot"/>
             </w:tabs>
           </w:pPr>
           <w:hyperlink w:history="1" w:anchor="_Toc59">
             <w:r>
-              <w:t xml:space="preserve">10. Importing VALD line lists</w:t>
+              <w:t xml:space="preserve">6.2 Plot-panel controls</w:t>
             </w:r>
             <w:r>
               <w:tab/>
@@ -691,14 +603,14 @@
         </w:p>
         <w:p>
           <w:pPr>
-            <w:pStyle w:val="TOC1"/>
+            <w:pStyle w:val="TOC2"/>
             <w:tabs>
               <w:tab w:val="right" w:pos="9638" w:leader="dot"/>
             </w:tabs>
           </w:pPr>
           <w:hyperlink w:history="1" w:anchor="_Toc60">
             <w:r>
-              <w:t xml:space="preserve">11. Loading control files (.ctl)</w:t>
+              <w:t xml:space="preserve">6.3 Slab intensity</w:t>
             </w:r>
             <w:r>
               <w:tab/>
@@ -720,7 +632,7 @@
           </w:pPr>
           <w:hyperlink w:history="1" w:anchor="_Toc61">
             <w:r>
-              <w:t xml:space="preserve">12. Python API</w:t>
+              <w:t xml:space="preserve">7. Menus</w:t>
             </w:r>
             <w:r>
               <w:tab/>
@@ -728,6 +640,28 @@
             <w:r>
               <w:fldChar w:fldCharType="begin" w:dirty="true"/>
               <w:instrText xml:space="preserve">PAGEREF _Toc61 \h</w:instrText>
+              <w:fldChar w:fldCharType="separate"/>
+              <w:fldChar w:fldCharType="end"/>
+            </w:r>
+          </w:hyperlink>
+        </w:p>
+        <w:p>
+          <w:pPr>
+            <w:pStyle w:val="TOC2"/>
+            <w:tabs>
+              <w:tab w:val="right" w:pos="9638" w:leader="dot"/>
+            </w:tabs>
+          </w:pPr>
+          <w:hyperlink w:history="1" w:anchor="_Toc62">
+            <w:r>
+              <w:t xml:space="preserve">7.1 Spectrum file format</w:t>
+            </w:r>
+            <w:r>
+              <w:tab/>
+            </w:r>
+            <w:r>
+              <w:fldChar w:fldCharType="begin" w:dirty="true"/>
+              <w:instrText xml:space="preserve">PAGEREF _Toc62 \h</w:instrText>
               <w:fldChar w:fldCharType="separate"/>
               <w:fldChar w:fldCharType="end"/>
             </w:r>
@@ -740,16 +674,16 @@
               <w:tab w:val="right" w:pos="9638" w:leader="dot"/>
             </w:tabs>
           </w:pPr>
-          <w:hyperlink w:history="1" w:anchor="_Toc62">
-            <w:r>
-              <w:t xml:space="preserve">13. Physical model and specifications</w:t>
+          <w:hyperlink w:history="1" w:anchor="_Toc63">
+            <w:r>
+              <w:t xml:space="preserve">8. Temperature sweep</w:t>
             </w:r>
             <w:r>
               <w:tab/>
             </w:r>
             <w:r>
               <w:fldChar w:fldCharType="begin" w:dirty="true"/>
-              <w:instrText xml:space="preserve">PAGEREF _Toc62 \h</w:instrText>
+              <w:instrText xml:space="preserve">PAGEREF _Toc63 \h</w:instrText>
               <w:fldChar w:fldCharType="separate"/>
               <w:fldChar w:fldCharType="end"/>
             </w:r>
@@ -757,36 +691,14 @@
         </w:p>
         <w:p>
           <w:pPr>
-            <w:pStyle w:val="TOC2"/>
-            <w:tabs>
-              <w:tab w:val="right" w:pos="9638" w:leader="dot"/>
-            </w:tabs>
-          </w:pPr>
-          <w:hyperlink w:history="1" w:anchor="_Toc63">
-            <w:r>
-              <w:t xml:space="preserve">13.1 Units and conventions</w:t>
-            </w:r>
-            <w:r>
-              <w:tab/>
-            </w:r>
-            <w:r>
-              <w:fldChar w:fldCharType="begin" w:dirty="true"/>
-              <w:instrText xml:space="preserve">PAGEREF _Toc63 \h</w:instrText>
-              <w:fldChar w:fldCharType="separate"/>
-              <w:fldChar w:fldCharType="end"/>
-            </w:r>
-          </w:hyperlink>
-        </w:p>
-        <w:p>
-          <w:pPr>
-            <w:pStyle w:val="TOC2"/>
+            <w:pStyle w:val="TOC1"/>
             <w:tabs>
               <w:tab w:val="right" w:pos="9638" w:leader="dot"/>
             </w:tabs>
           </w:pPr>
           <w:hyperlink w:history="1" w:anchor="_Toc64">
             <w:r>
-              <w:t xml:space="preserve">13.2 Calculation flow</w:t>
+              <w:t xml:space="preserve">9. Fitting an observed spectrum</w:t>
             </w:r>
             <w:r>
               <w:tab/>
@@ -808,7 +720,7 @@
           </w:pPr>
           <w:hyperlink w:history="1" w:anchor="_Toc65">
             <w:r>
-              <w:t xml:space="preserve">13.3 Line shapes</w:t>
+              <w:t xml:space="preserve">9.1 Settings</w:t>
             </w:r>
             <w:r>
               <w:tab/>
@@ -830,7 +742,7 @@
           </w:pPr>
           <w:hyperlink w:history="1" w:anchor="_Toc66">
             <w:r>
-              <w:t xml:space="preserve">13.4 Instrument-function convolution</w:t>
+              <w:t xml:space="preserve">9.2 Search method</w:t>
             </w:r>
             <w:r>
               <w:tab/>
@@ -852,7 +764,7 @@
           </w:pPr>
           <w:hyperlink w:history="1" w:anchor="_Toc67">
             <w:r>
-              <w:t xml:space="preserve">14. Databases</w:t>
+              <w:t xml:space="preserve">10. Importing VALD line lists</w:t>
             </w:r>
             <w:r>
               <w:tab/>
@@ -867,14 +779,14 @@
         </w:p>
         <w:p>
           <w:pPr>
-            <w:pStyle w:val="TOC2"/>
+            <w:pStyle w:val="TOC1"/>
             <w:tabs>
               <w:tab w:val="right" w:pos="9638" w:leader="dot"/>
             </w:tabs>
           </w:pPr>
           <w:hyperlink w:history="1" w:anchor="_Toc68">
             <w:r>
-              <w:t xml:space="preserve">14.1 Approximations for the added molecules</w:t>
+              <w:t xml:space="preserve">11. Loading control files (.ctl)</w:t>
             </w:r>
             <w:r>
               <w:tab/>
@@ -889,14 +801,14 @@
         </w:p>
         <w:p>
           <w:pPr>
-            <w:pStyle w:val="TOC2"/>
+            <w:pStyle w:val="TOC1"/>
             <w:tabs>
               <w:tab w:val="right" w:pos="9638" w:leader="dot"/>
             </w:tabs>
           </w:pPr>
           <w:hyperlink w:history="1" w:anchor="_Toc69">
             <w:r>
-              <w:t xml:space="preserve">14.2 Adding species</w:t>
+              <w:t xml:space="preserve">12. Python API</w:t>
             </w:r>
             <w:r>
               <w:tab/>
@@ -918,7 +830,7 @@
           </w:pPr>
           <w:hyperlink w:history="1" w:anchor="_Toc70">
             <w:r>
-              <w:t xml:space="preserve">15. Limitations and cautions</w:t>
+              <w:t xml:space="preserve">13. Physical model and specifications</w:t>
             </w:r>
             <w:r>
               <w:tab/>
@@ -933,14 +845,14 @@
         </w:p>
         <w:p>
           <w:pPr>
-            <w:pStyle w:val="TOC1"/>
+            <w:pStyle w:val="TOC2"/>
             <w:tabs>
               <w:tab w:val="right" w:pos="9638" w:leader="dot"/>
             </w:tabs>
           </w:pPr>
           <w:hyperlink w:history="1" w:anchor="_Toc71">
             <w:r>
-              <w:t xml:space="preserve">16. Credits and references</w:t>
+              <w:t xml:space="preserve">13.1 Units and conventions</w:t>
             </w:r>
             <w:r>
               <w:tab/>
@@ -962,7 +874,7 @@
           </w:pPr>
           <w:hyperlink w:history="1" w:anchor="_Toc72">
             <w:r>
-              <w:t xml:space="preserve">16.1 Required citations</w:t>
+              <w:t xml:space="preserve">13.2 Calculation flow</w:t>
             </w:r>
             <w:r>
               <w:tab/>
@@ -984,7 +896,7 @@
           </w:pPr>
           <w:hyperlink w:history="1" w:anchor="_Toc73">
             <w:r>
-              <w:t xml:space="preserve">16.2 Further references</w:t>
+              <w:t xml:space="preserve">13.3 Line shapes</w:t>
             </w:r>
             <w:r>
               <w:tab/>
@@ -1006,7 +918,7 @@
           </w:pPr>
           <w:hyperlink w:history="1" w:anchor="_Toc74">
             <w:r>
-              <w:t xml:space="preserve">16.3 Terms of use</w:t>
+              <w:t xml:space="preserve">13.4 Instrument-function convolution</w:t>
             </w:r>
             <w:r>
               <w:tab/>
@@ -1014,6 +926,182 @@
             <w:r>
               <w:fldChar w:fldCharType="begin" w:dirty="true"/>
               <w:instrText xml:space="preserve">PAGEREF _Toc74 \h</w:instrText>
+              <w:fldChar w:fldCharType="separate"/>
+              <w:fldChar w:fldCharType="end"/>
+            </w:r>
+          </w:hyperlink>
+        </w:p>
+        <w:p>
+          <w:pPr>
+            <w:pStyle w:val="TOC1"/>
+            <w:tabs>
+              <w:tab w:val="right" w:pos="9638" w:leader="dot"/>
+            </w:tabs>
+          </w:pPr>
+          <w:hyperlink w:history="1" w:anchor="_Toc75">
+            <w:r>
+              <w:t xml:space="preserve">14. Databases</w:t>
+            </w:r>
+            <w:r>
+              <w:tab/>
+            </w:r>
+            <w:r>
+              <w:fldChar w:fldCharType="begin" w:dirty="true"/>
+              <w:instrText xml:space="preserve">PAGEREF _Toc75 \h</w:instrText>
+              <w:fldChar w:fldCharType="separate"/>
+              <w:fldChar w:fldCharType="end"/>
+            </w:r>
+          </w:hyperlink>
+        </w:p>
+        <w:p>
+          <w:pPr>
+            <w:pStyle w:val="TOC2"/>
+            <w:tabs>
+              <w:tab w:val="right" w:pos="9638" w:leader="dot"/>
+            </w:tabs>
+          </w:pPr>
+          <w:hyperlink w:history="1" w:anchor="_Toc76">
+            <w:r>
+              <w:t xml:space="preserve">14.1 Approximations for the added molecules</w:t>
+            </w:r>
+            <w:r>
+              <w:tab/>
+            </w:r>
+            <w:r>
+              <w:fldChar w:fldCharType="begin" w:dirty="true"/>
+              <w:instrText xml:space="preserve">PAGEREF _Toc76 \h</w:instrText>
+              <w:fldChar w:fldCharType="separate"/>
+              <w:fldChar w:fldCharType="end"/>
+            </w:r>
+          </w:hyperlink>
+        </w:p>
+        <w:p>
+          <w:pPr>
+            <w:pStyle w:val="TOC2"/>
+            <w:tabs>
+              <w:tab w:val="right" w:pos="9638" w:leader="dot"/>
+            </w:tabs>
+          </w:pPr>
+          <w:hyperlink w:history="1" w:anchor="_Toc77">
+            <w:r>
+              <w:t xml:space="preserve">14.2 Adding species</w:t>
+            </w:r>
+            <w:r>
+              <w:tab/>
+            </w:r>
+            <w:r>
+              <w:fldChar w:fldCharType="begin" w:dirty="true"/>
+              <w:instrText xml:space="preserve">PAGEREF _Toc77 \h</w:instrText>
+              <w:fldChar w:fldCharType="separate"/>
+              <w:fldChar w:fldCharType="end"/>
+            </w:r>
+          </w:hyperlink>
+        </w:p>
+        <w:p>
+          <w:pPr>
+            <w:pStyle w:val="TOC1"/>
+            <w:tabs>
+              <w:tab w:val="right" w:pos="9638" w:leader="dot"/>
+            </w:tabs>
+          </w:pPr>
+          <w:hyperlink w:history="1" w:anchor="_Toc78">
+            <w:r>
+              <w:t xml:space="preserve">15. Limitations and cautions</w:t>
+            </w:r>
+            <w:r>
+              <w:tab/>
+            </w:r>
+            <w:r>
+              <w:fldChar w:fldCharType="begin" w:dirty="true"/>
+              <w:instrText xml:space="preserve">PAGEREF _Toc78 \h</w:instrText>
+              <w:fldChar w:fldCharType="separate"/>
+              <w:fldChar w:fldCharType="end"/>
+            </w:r>
+          </w:hyperlink>
+        </w:p>
+        <w:p>
+          <w:pPr>
+            <w:pStyle w:val="TOC1"/>
+            <w:tabs>
+              <w:tab w:val="right" w:pos="9638" w:leader="dot"/>
+            </w:tabs>
+          </w:pPr>
+          <w:hyperlink w:history="1" w:anchor="_Toc79">
+            <w:r>
+              <w:t xml:space="preserve">16. Credits and references</w:t>
+            </w:r>
+            <w:r>
+              <w:tab/>
+            </w:r>
+            <w:r>
+              <w:fldChar w:fldCharType="begin" w:dirty="true"/>
+              <w:instrText xml:space="preserve">PAGEREF _Toc79 \h</w:instrText>
+              <w:fldChar w:fldCharType="separate"/>
+              <w:fldChar w:fldCharType="end"/>
+            </w:r>
+          </w:hyperlink>
+        </w:p>
+        <w:p>
+          <w:pPr>
+            <w:pStyle w:val="TOC2"/>
+            <w:tabs>
+              <w:tab w:val="right" w:pos="9638" w:leader="dot"/>
+            </w:tabs>
+          </w:pPr>
+          <w:hyperlink w:history="1" w:anchor="_Toc80">
+            <w:r>
+              <w:t xml:space="preserve">16.1 Required citations</w:t>
+            </w:r>
+            <w:r>
+              <w:tab/>
+            </w:r>
+            <w:r>
+              <w:fldChar w:fldCharType="begin" w:dirty="true"/>
+              <w:instrText xml:space="preserve">PAGEREF _Toc80 \h</w:instrText>
+              <w:fldChar w:fldCharType="separate"/>
+              <w:fldChar w:fldCharType="end"/>
+            </w:r>
+          </w:hyperlink>
+        </w:p>
+        <w:p>
+          <w:pPr>
+            <w:pStyle w:val="TOC2"/>
+            <w:tabs>
+              <w:tab w:val="right" w:pos="9638" w:leader="dot"/>
+            </w:tabs>
+          </w:pPr>
+          <w:hyperlink w:history="1" w:anchor="_Toc81">
+            <w:r>
+              <w:t xml:space="preserve">16.2 Further references</w:t>
+            </w:r>
+            <w:r>
+              <w:tab/>
+            </w:r>
+            <w:r>
+              <w:fldChar w:fldCharType="begin" w:dirty="true"/>
+              <w:instrText xml:space="preserve">PAGEREF _Toc81 \h</w:instrText>
+              <w:fldChar w:fldCharType="separate"/>
+              <w:fldChar w:fldCharType="end"/>
+            </w:r>
+          </w:hyperlink>
+        </w:p>
+        <w:p>
+          <w:pPr>
+            <w:pStyle w:val="TOC2"/>
+            <w:tabs>
+              <w:tab w:val="right" w:pos="9638" w:leader="dot"/>
+            </w:tabs>
+          </w:pPr>
+          <w:hyperlink w:history="1" w:anchor="_Toc82">
+            <w:r>
+              <w:t xml:space="preserve">16.3 Terms of use</w:t>
+            </w:r>
+            <w:r>
+              <w:tab/>
+            </w:r>
+            <w:r>
+              <w:fldChar w:fldCharType="begin" w:dirty="true"/>
+              <w:instrText xml:space="preserve">PAGEREF _Toc82 \h</w:instrText>
               <w:fldChar w:fldCharType="separate"/>
               <w:fldChar w:fldCharType="end"/>
             </w:r>
@@ -1039,11 +1127,11 @@
         <w:pStyle w:val="Heading1"/>
         <w:pageBreakBefore/>
       </w:pPr>
-      <w:bookmarkStart w:name="_Toc38" w:id="38"/>
+      <w:bookmarkStart w:name="_Toc42" w:id="42"/>
       <w:r>
         <w:t xml:space="preserve">1. Overview</w:t>
       </w:r>
-      <w:bookmarkEnd w:id="38"/>
+      <w:bookmarkEnd w:id="42"/>
     </w:p>
     <w:p>
       <w:pPr>
@@ -1090,11 +1178,11 @@
       <w:pPr>
         <w:pStyle w:val="Heading2"/>
       </w:pPr>
-      <w:bookmarkStart w:name="_Toc39" w:id="39"/>
+      <w:bookmarkStart w:name="_Toc43" w:id="43"/>
       <w:r>
         <w:t xml:space="preserve">1.1 Applications</w:t>
       </w:r>
-      <w:bookmarkEnd w:id="39"/>
+      <w:bookmarkEnd w:id="43"/>
     </w:p>
     <w:p>
       <w:pPr>
@@ -1152,11 +1240,11 @@
       <w:pPr>
         <w:pStyle w:val="Heading2"/>
       </w:pPr>
-      <w:bookmarkStart w:name="_Toc40" w:id="40"/>
+      <w:bookmarkStart w:name="_Toc44" w:id="44"/>
       <w:r>
         <w:t xml:space="preserve">1.2 Main features</w:t>
       </w:r>
-      <w:bookmarkEnd w:id="40"/>
+      <w:bookmarkEnd w:id="44"/>
     </w:p>
     <w:p>
       <w:pPr>
@@ -1279,11 +1367,11 @@
       <w:pPr>
         <w:pStyle w:val="Heading2"/>
       </w:pPr>
-      <w:bookmarkStart w:name="_Toc41" w:id="41"/>
+      <w:bookmarkStart w:name="_Toc45" w:id="45"/>
       <w:r>
         <w:t xml:space="preserve">1.3 Verification</w:t>
       </w:r>
-      <w:bookmarkEnd w:id="41"/>
+      <w:bookmarkEnd w:id="45"/>
     </w:p>
     <w:p>
       <w:pPr>
@@ -1297,11 +1385,11 @@
       <w:pPr>
         <w:pStyle w:val="Heading2"/>
       </w:pPr>
-      <w:bookmarkStart w:name="_Toc42" w:id="42"/>
+      <w:bookmarkStart w:name="_Toc46" w:id="46"/>
       <w:r>
         <w:t xml:space="preserve">1.4 Citation (required)</w:t>
       </w:r>
-      <w:bookmarkEnd w:id="42"/>
+      <w:bookmarkEnd w:id="46"/>
     </w:p>
     <w:p>
       <w:pPr>
@@ -1386,11 +1474,19 @@
         <w:pStyle w:val="Heading1"/>
         <w:pageBreakBefore/>
       </w:pPr>
-      <w:bookmarkStart w:name="_Toc43" w:id="43"/>
+      <w:bookmarkStart w:name="_Toc47" w:id="47"/>
       <w:r>
         <w:t xml:space="preserve">2. Requirements and installation</w:t>
       </w:r>
-      <w:bookmarkEnd w:id="43"/>
+      <w:bookmarkEnd w:id="47"/>
+    </w:p>
+    <w:p>
+      <w:pPr>
+        <w:spacing w:after="120"/>
+      </w:pPr>
+      <w:r>
+        <w:t xml:space="preserve">METEORAD is distributed as a Windows installer and a macOS disk image (dmg). No Python or other additional software is required.</w:t>
+      </w:r>
     </w:p>
     <w:p>
       <w:pPr>
@@ -1411,7 +1507,7 @@
           <w:sz w:val="19"/>
           <w:szCs w:val="19"/>
         </w:rPr>
-        <w:t xml:space="preserve">Requirements</w:t>
+        <w:t xml:space="preserve">Requirements and distribution files</w:t>
       </w:r>
     </w:p>
     <w:tbl>
@@ -1427,8 +1523,9 @@
         </w:tblBorders>
       </w:tblPr>
       <w:tblGrid>
-        <w:gridCol w:w="2409"/>
-        <w:gridCol w:w="7229"/>
+        <w:gridCol w:w="1927"/>
+        <w:gridCol w:w="3855"/>
+        <w:gridCol w:w="3856"/>
       </w:tblGrid>
       <w:tr>
         <w:trPr>
@@ -1436,7 +1533,7 @@
         </w:trPr>
         <w:tc>
           <w:tcPr>
-            <w:tcW w:type="dxa" w:w="2409"/>
+            <w:tcW w:type="dxa" w:w="1927"/>
             <w:tcBorders>
               <w:top w:val="single" w:color="B8C0CC" w:sz="4"/>
               <w:left w:val="single" w:color="B8C0CC" w:sz="4"/>
@@ -1466,7 +1563,7 @@
         </w:tc>
         <w:tc>
           <w:tcPr>
-            <w:tcW w:type="dxa" w:w="7229"/>
+            <w:tcW w:type="dxa" w:w="3855"/>
             <w:tcBorders>
               <w:top w:val="single" w:color="B8C0CC" w:sz="4"/>
               <w:left w:val="single" w:color="B8C0CC" w:sz="4"/>
@@ -1490,7 +1587,37 @@
                 <w:sz w:val="19"/>
                 <w:szCs w:val="19"/>
               </w:rPr>
-              <w:t xml:space="preserve">Requirement</w:t>
+              <w:t xml:space="preserve">Windows</w:t>
+            </w:r>
+          </w:p>
+        </w:tc>
+        <w:tc>
+          <w:tcPr>
+            <w:tcW w:type="dxa" w:w="3856"/>
+            <w:tcBorders>
+              <w:top w:val="single" w:color="B8C0CC" w:sz="4"/>
+              <w:left w:val="single" w:color="B8C0CC" w:sz="4"/>
+              <w:bottom w:val="single" w:color="B8C0CC" w:sz="4"/>
+              <w:right w:val="single" w:color="B8C0CC" w:sz="4"/>
+            </w:tcBorders>
+            <w:shd w:fill="1F3A5F" w:color="auto" w:val="clear"/>
+            <w:tcMar>
+              <w:top w:type="dxa" w:w="50"/>
+              <w:left w:type="dxa" w:w="90"/>
+              <w:bottom w:type="dxa" w:w="50"/>
+              <w:right w:type="dxa" w:w="90"/>
+            </w:tcMar>
+          </w:tcPr>
+          <w:p>
+            <w:r>
+              <w:rPr>
+                <w:b/>
+                <w:bCs/>
+                <w:color w:val="FFFFFF"/>
+                <w:sz w:val="19"/>
+                <w:szCs w:val="19"/>
+              </w:rPr>
+              <w:t xml:space="preserve">macOS</w:t>
             </w:r>
           </w:p>
         </w:tc>
@@ -1498,7 +1625,7 @@
       <w:tr>
         <w:tc>
           <w:tcPr>
-            <w:tcW w:type="dxa" w:w="2409"/>
+            <w:tcW w:type="dxa" w:w="1927"/>
             <w:tcBorders>
               <w:top w:val="single" w:color="B8C0CC" w:sz="4"/>
               <w:left w:val="single" w:color="B8C0CC" w:sz="4"/>
@@ -1524,27 +1651,53 @@
         </w:tc>
         <w:tc>
           <w:tcPr>
-            <w:tcW w:type="dxa" w:w="7229"/>
-            <w:tcBorders>
-              <w:top w:val="single" w:color="B8C0CC" w:sz="4"/>
-              <w:left w:val="single" w:color="B8C0CC" w:sz="4"/>
-              <w:bottom w:val="single" w:color="B8C0CC" w:sz="4"/>
-              <w:right w:val="single" w:color="B8C0CC" w:sz="4"/>
-            </w:tcBorders>
-            <w:tcMar>
-              <w:top w:type="dxa" w:w="50"/>
-              <w:left w:type="dxa" w:w="90"/>
-              <w:bottom w:type="dxa" w:w="50"/>
-              <w:right w:type="dxa" w:w="90"/>
-            </w:tcMar>
-          </w:tcPr>
-          <w:p>
-            <w:r>
-              <w:rPr>
-                <w:sz w:val="19"/>
-                <w:szCs w:val="19"/>
-              </w:rPr>
-              <w:t xml:space="preserve">macOS / Linux / Windows (anywhere Python runs)</w:t>
+            <w:tcW w:type="dxa" w:w="3855"/>
+            <w:tcBorders>
+              <w:top w:val="single" w:color="B8C0CC" w:sz="4"/>
+              <w:left w:val="single" w:color="B8C0CC" w:sz="4"/>
+              <w:bottom w:val="single" w:color="B8C0CC" w:sz="4"/>
+              <w:right w:val="single" w:color="B8C0CC" w:sz="4"/>
+            </w:tcBorders>
+            <w:tcMar>
+              <w:top w:type="dxa" w:w="50"/>
+              <w:left w:type="dxa" w:w="90"/>
+              <w:bottom w:type="dxa" w:w="50"/>
+              <w:right w:type="dxa" w:w="90"/>
+            </w:tcMar>
+          </w:tcPr>
+          <w:p>
+            <w:r>
+              <w:rPr>
+                <w:sz w:val="19"/>
+                <w:szCs w:val="19"/>
+              </w:rPr>
+              <w:t xml:space="preserve">Windows 10 / 11 (64-bit)</w:t>
+            </w:r>
+          </w:p>
+        </w:tc>
+        <w:tc>
+          <w:tcPr>
+            <w:tcW w:type="dxa" w:w="3856"/>
+            <w:tcBorders>
+              <w:top w:val="single" w:color="B8C0CC" w:sz="4"/>
+              <w:left w:val="single" w:color="B8C0CC" w:sz="4"/>
+              <w:bottom w:val="single" w:color="B8C0CC" w:sz="4"/>
+              <w:right w:val="single" w:color="B8C0CC" w:sz="4"/>
+            </w:tcBorders>
+            <w:tcMar>
+              <w:top w:type="dxa" w:w="50"/>
+              <w:left w:type="dxa" w:w="90"/>
+              <w:bottom w:type="dxa" w:w="50"/>
+              <w:right w:type="dxa" w:w="90"/>
+            </w:tcMar>
+          </w:tcPr>
+          <w:p>
+            <w:r>
+              <w:rPr>
+                <w:sz w:val="19"/>
+                <w:szCs w:val="19"/>
+              </w:rPr>
+              <w:t xml:space="preserve">macOS 14.4 or later, Apple Silicon (M1 or later)</w:t>
             </w:r>
           </w:p>
         </w:tc>
@@ -1552,53 +1705,108 @@
       <w:tr>
         <w:tc>
           <w:tcPr>
-            <w:tcW w:type="dxa" w:w="2409"/>
-            <w:tcBorders>
-              <w:top w:val="single" w:color="B8C0CC" w:sz="4"/>
-              <w:left w:val="single" w:color="B8C0CC" w:sz="4"/>
-              <w:bottom w:val="single" w:color="B8C0CC" w:sz="4"/>
-              <w:right w:val="single" w:color="B8C0CC" w:sz="4"/>
-            </w:tcBorders>
-            <w:tcMar>
-              <w:top w:type="dxa" w:w="50"/>
-              <w:left w:type="dxa" w:w="90"/>
-              <w:bottom w:type="dxa" w:w="50"/>
-              <w:right w:type="dxa" w:w="90"/>
-            </w:tcMar>
-          </w:tcPr>
-          <w:p>
-            <w:r>
-              <w:rPr>
-                <w:sz w:val="19"/>
-                <w:szCs w:val="19"/>
-              </w:rPr>
-              <w:t xml:space="preserve">Python</w:t>
-            </w:r>
-          </w:p>
-        </w:tc>
-        <w:tc>
-          <w:tcPr>
-            <w:tcW w:type="dxa" w:w="7229"/>
-            <w:tcBorders>
-              <w:top w:val="single" w:color="B8C0CC" w:sz="4"/>
-              <w:left w:val="single" w:color="B8C0CC" w:sz="4"/>
-              <w:bottom w:val="single" w:color="B8C0CC" w:sz="4"/>
-              <w:right w:val="single" w:color="B8C0CC" w:sz="4"/>
-            </w:tcBorders>
-            <w:tcMar>
-              <w:top w:type="dxa" w:w="50"/>
-              <w:left w:type="dxa" w:w="90"/>
-              <w:bottom w:type="dxa" w:w="50"/>
-              <w:right w:type="dxa" w:w="90"/>
-            </w:tcMar>
-          </w:tcPr>
-          <w:p>
-            <w:r>
-              <w:rPr>
-                <w:sz w:val="19"/>
-                <w:szCs w:val="19"/>
-              </w:rPr>
-              <w:t xml:space="preserve">3.9 or later</w:t>
+            <w:tcW w:type="dxa" w:w="1927"/>
+            <w:tcBorders>
+              <w:top w:val="single" w:color="B8C0CC" w:sz="4"/>
+              <w:left w:val="single" w:color="B8C0CC" w:sz="4"/>
+              <w:bottom w:val="single" w:color="B8C0CC" w:sz="4"/>
+              <w:right w:val="single" w:color="B8C0CC" w:sz="4"/>
+            </w:tcBorders>
+            <w:tcMar>
+              <w:top w:type="dxa" w:w="50"/>
+              <w:left w:type="dxa" w:w="90"/>
+              <w:bottom w:type="dxa" w:w="50"/>
+              <w:right w:type="dxa" w:w="90"/>
+            </w:tcMar>
+          </w:tcPr>
+          <w:p>
+            <w:r>
+              <w:rPr>
+                <w:sz w:val="19"/>
+                <w:szCs w:val="19"/>
+              </w:rPr>
+              <w:t xml:space="preserve">File</w:t>
+            </w:r>
+          </w:p>
+        </w:tc>
+        <w:tc>
+          <w:tcPr>
+            <w:tcW w:type="dxa" w:w="3855"/>
+            <w:tcBorders>
+              <w:top w:val="single" w:color="B8C0CC" w:sz="4"/>
+              <w:left w:val="single" w:color="B8C0CC" w:sz="4"/>
+              <w:bottom w:val="single" w:color="B8C0CC" w:sz="4"/>
+              <w:right w:val="single" w:color="B8C0CC" w:sz="4"/>
+            </w:tcBorders>
+            <w:tcMar>
+              <w:top w:type="dxa" w:w="50"/>
+              <w:left w:type="dxa" w:w="90"/>
+              <w:bottom w:type="dxa" w:w="50"/>
+              <w:right w:type="dxa" w:w="90"/>
+            </w:tcMar>
+          </w:tcPr>
+          <w:p>
+            <w:r>
+              <w:rPr>
+                <w:rFonts w:ascii="Consolas" w:cs="Consolas" w:eastAsia="Consolas" w:hAnsi="Consolas"/>
+                <w:color w:val="7A2E00"/>
+                <w:sz w:val="19"/>
+                <w:szCs w:val="19"/>
+              </w:rPr>
+              <w:t xml:space="preserve">METEORAD-&lt;ver&gt;-Windows-x64-Setup.exe</w:t>
+            </w:r>
+          </w:p>
+          <w:p>
+            <w:r>
+              <w:rPr>
+                <w:sz w:val="19"/>
+                <w:szCs w:val="19"/>
+              </w:rPr>
+              <w:t xml:space="preserve">(portable: </w:t>
+            </w:r>
+            <w:r>
+              <w:rPr>
+                <w:rFonts w:ascii="Consolas" w:cs="Consolas" w:eastAsia="Consolas" w:hAnsi="Consolas"/>
+                <w:color w:val="7A2E00"/>
+                <w:sz w:val="19"/>
+                <w:szCs w:val="19"/>
+              </w:rPr>
+              <w:t xml:space="preserve">METEORAD-&lt;ver&gt;-Windows-x64.zip</w:t>
+            </w:r>
+            <w:r>
+              <w:rPr>
+                <w:sz w:val="19"/>
+                <w:szCs w:val="19"/>
+              </w:rPr>
+              <w:t xml:space="preserve">)</w:t>
+            </w:r>
+          </w:p>
+        </w:tc>
+        <w:tc>
+          <w:tcPr>
+            <w:tcW w:type="dxa" w:w="3856"/>
+            <w:tcBorders>
+              <w:top w:val="single" w:color="B8C0CC" w:sz="4"/>
+              <w:left w:val="single" w:color="B8C0CC" w:sz="4"/>
+              <w:bottom w:val="single" w:color="B8C0CC" w:sz="4"/>
+              <w:right w:val="single" w:color="B8C0CC" w:sz="4"/>
+            </w:tcBorders>
+            <w:tcMar>
+              <w:top w:type="dxa" w:w="50"/>
+              <w:left w:type="dxa" w:w="90"/>
+              <w:bottom w:type="dxa" w:w="50"/>
+              <w:right w:type="dxa" w:w="90"/>
+            </w:tcMar>
+          </w:tcPr>
+          <w:p>
+            <w:r>
+              <w:rPr>
+                <w:rFonts w:ascii="Consolas" w:cs="Consolas" w:eastAsia="Consolas" w:hAnsi="Consolas"/>
+                <w:color w:val="7A2E00"/>
+                <w:sz w:val="19"/>
+                <w:szCs w:val="19"/>
+              </w:rPr>
+              <w:t xml:space="preserve">METEORAD-&lt;ver&gt;-macOS-arm64.dmg</w:t>
             </w:r>
           </w:p>
         </w:tc>
@@ -1606,53 +1814,79 @@
       <w:tr>
         <w:tc>
           <w:tcPr>
-            <w:tcW w:type="dxa" w:w="2409"/>
-            <w:tcBorders>
-              <w:top w:val="single" w:color="B8C0CC" w:sz="4"/>
-              <w:left w:val="single" w:color="B8C0CC" w:sz="4"/>
-              <w:bottom w:val="single" w:color="B8C0CC" w:sz="4"/>
-              <w:right w:val="single" w:color="B8C0CC" w:sz="4"/>
-            </w:tcBorders>
-            <w:tcMar>
-              <w:top w:type="dxa" w:w="50"/>
-              <w:left w:type="dxa" w:w="90"/>
-              <w:bottom w:type="dxa" w:w="50"/>
-              <w:right w:type="dxa" w:w="90"/>
-            </w:tcMar>
-          </w:tcPr>
-          <w:p>
-            <w:r>
-              <w:rPr>
-                <w:sz w:val="19"/>
-                <w:szCs w:val="19"/>
-              </w:rPr>
-              <w:t xml:space="preserve">Computational core</w:t>
-            </w:r>
-          </w:p>
-        </w:tc>
-        <w:tc>
-          <w:tcPr>
-            <w:tcW w:type="dxa" w:w="7229"/>
-            <w:tcBorders>
-              <w:top w:val="single" w:color="B8C0CC" w:sz="4"/>
-              <w:left w:val="single" w:color="B8C0CC" w:sz="4"/>
-              <w:bottom w:val="single" w:color="B8C0CC" w:sz="4"/>
-              <w:right w:val="single" w:color="B8C0CC" w:sz="4"/>
-            </w:tcBorders>
-            <w:tcMar>
-              <w:top w:type="dxa" w:w="50"/>
-              <w:left w:type="dxa" w:w="90"/>
-              <w:bottom w:type="dxa" w:w="50"/>
-              <w:right w:type="dxa" w:w="90"/>
-            </w:tcMar>
-          </w:tcPr>
-          <w:p>
-            <w:r>
-              <w:rPr>
-                <w:sz w:val="19"/>
-                <w:szCs w:val="19"/>
-              </w:rPr>
-              <w:t xml:space="preserve">numpy</w:t>
+            <w:tcW w:type="dxa" w:w="1927"/>
+            <w:tcBorders>
+              <w:top w:val="single" w:color="B8C0CC" w:sz="4"/>
+              <w:left w:val="single" w:color="B8C0CC" w:sz="4"/>
+              <w:bottom w:val="single" w:color="B8C0CC" w:sz="4"/>
+              <w:right w:val="single" w:color="B8C0CC" w:sz="4"/>
+            </w:tcBorders>
+            <w:tcMar>
+              <w:top w:type="dxa" w:w="50"/>
+              <w:left w:type="dxa" w:w="90"/>
+              <w:bottom w:type="dxa" w:w="50"/>
+              <w:right w:type="dxa" w:w="90"/>
+            </w:tcMar>
+          </w:tcPr>
+          <w:p>
+            <w:r>
+              <w:rPr>
+                <w:sz w:val="19"/>
+                <w:szCs w:val="19"/>
+              </w:rPr>
+              <w:t xml:space="preserve">Disk space</w:t>
+            </w:r>
+          </w:p>
+        </w:tc>
+        <w:tc>
+          <w:tcPr>
+            <w:tcW w:type="dxa" w:w="3855"/>
+            <w:tcBorders>
+              <w:top w:val="single" w:color="B8C0CC" w:sz="4"/>
+              <w:left w:val="single" w:color="B8C0CC" w:sz="4"/>
+              <w:bottom w:val="single" w:color="B8C0CC" w:sz="4"/>
+              <w:right w:val="single" w:color="B8C0CC" w:sz="4"/>
+            </w:tcBorders>
+            <w:tcMar>
+              <w:top w:type="dxa" w:w="50"/>
+              <w:left w:type="dxa" w:w="90"/>
+              <w:bottom w:type="dxa" w:w="50"/>
+              <w:right w:type="dxa" w:w="90"/>
+            </w:tcMar>
+          </w:tcPr>
+          <w:p>
+            <w:r>
+              <w:rPr>
+                <w:sz w:val="19"/>
+                <w:szCs w:val="19"/>
+              </w:rPr>
+              <w:t xml:space="preserve">about 200 MB</w:t>
+            </w:r>
+          </w:p>
+        </w:tc>
+        <w:tc>
+          <w:tcPr>
+            <w:tcW w:type="dxa" w:w="3856"/>
+            <w:tcBorders>
+              <w:top w:val="single" w:color="B8C0CC" w:sz="4"/>
+              <w:left w:val="single" w:color="B8C0CC" w:sz="4"/>
+              <w:bottom w:val="single" w:color="B8C0CC" w:sz="4"/>
+              <w:right w:val="single" w:color="B8C0CC" w:sz="4"/>
+            </w:tcBorders>
+            <w:tcMar>
+              <w:top w:type="dxa" w:w="50"/>
+              <w:left w:type="dxa" w:w="90"/>
+              <w:bottom w:type="dxa" w:w="50"/>
+              <w:right w:type="dxa" w:w="90"/>
+            </w:tcMar>
+          </w:tcPr>
+          <w:p>
+            <w:r>
+              <w:rPr>
+                <w:sz w:val="19"/>
+                <w:szCs w:val="19"/>
+              </w:rPr>
+              <w:t xml:space="preserve">about 150 MB</w:t>
             </w:r>
           </w:p>
         </w:tc>
@@ -1660,53 +1894,79 @@
       <w:tr>
         <w:tc>
           <w:tcPr>
-            <w:tcW w:type="dxa" w:w="2409"/>
-            <w:tcBorders>
-              <w:top w:val="single" w:color="B8C0CC" w:sz="4"/>
-              <w:left w:val="single" w:color="B8C0CC" w:sz="4"/>
-              <w:bottom w:val="single" w:color="B8C0CC" w:sz="4"/>
-              <w:right w:val="single" w:color="B8C0CC" w:sz="4"/>
-            </w:tcBorders>
-            <w:tcMar>
-              <w:top w:type="dxa" w:w="50"/>
-              <w:left w:type="dxa" w:w="90"/>
-              <w:bottom w:type="dxa" w:w="50"/>
-              <w:right w:type="dxa" w:w="90"/>
-            </w:tcMar>
-          </w:tcPr>
-          <w:p>
-            <w:r>
-              <w:rPr>
-                <w:sz w:val="19"/>
-                <w:szCs w:val="19"/>
-              </w:rPr>
-              <w:t xml:space="preserve">GUI</w:t>
-            </w:r>
-          </w:p>
-        </w:tc>
-        <w:tc>
-          <w:tcPr>
-            <w:tcW w:type="dxa" w:w="7229"/>
-            <w:tcBorders>
-              <w:top w:val="single" w:color="B8C0CC" w:sz="4"/>
-              <w:left w:val="single" w:color="B8C0CC" w:sz="4"/>
-              <w:bottom w:val="single" w:color="B8C0CC" w:sz="4"/>
-              <w:right w:val="single" w:color="B8C0CC" w:sz="4"/>
-            </w:tcBorders>
-            <w:tcMar>
-              <w:top w:type="dxa" w:w="50"/>
-              <w:left w:type="dxa" w:w="90"/>
-              <w:bottom w:type="dxa" w:w="50"/>
-              <w:right w:type="dxa" w:w="90"/>
-            </w:tcMar>
-          </w:tcPr>
-          <w:p>
-            <w:r>
-              <w:rPr>
-                <w:sz w:val="19"/>
-                <w:szCs w:val="19"/>
-              </w:rPr>
-              <w:t xml:space="preserve">matplotlib, PySide6 (Qt 6)</w:t>
+            <w:tcW w:type="dxa" w:w="1927"/>
+            <w:tcBorders>
+              <w:top w:val="single" w:color="B8C0CC" w:sz="4"/>
+              <w:left w:val="single" w:color="B8C0CC" w:sz="4"/>
+              <w:bottom w:val="single" w:color="B8C0CC" w:sz="4"/>
+              <w:right w:val="single" w:color="B8C0CC" w:sz="4"/>
+            </w:tcBorders>
+            <w:tcMar>
+              <w:top w:type="dxa" w:w="50"/>
+              <w:left w:type="dxa" w:w="90"/>
+              <w:bottom w:type="dxa" w:w="50"/>
+              <w:right w:type="dxa" w:w="90"/>
+            </w:tcMar>
+          </w:tcPr>
+          <w:p>
+            <w:r>
+              <w:rPr>
+                <w:sz w:val="19"/>
+                <w:szCs w:val="19"/>
+              </w:rPr>
+              <w:t xml:space="preserve">Code signing</w:t>
+            </w:r>
+          </w:p>
+        </w:tc>
+        <w:tc>
+          <w:tcPr>
+            <w:tcW w:type="dxa" w:w="3855"/>
+            <w:tcBorders>
+              <w:top w:val="single" w:color="B8C0CC" w:sz="4"/>
+              <w:left w:val="single" w:color="B8C0CC" w:sz="4"/>
+              <w:bottom w:val="single" w:color="B8C0CC" w:sz="4"/>
+              <w:right w:val="single" w:color="B8C0CC" w:sz="4"/>
+            </w:tcBorders>
+            <w:tcMar>
+              <w:top w:type="dxa" w:w="50"/>
+              <w:left w:type="dxa" w:w="90"/>
+              <w:bottom w:type="dxa" w:w="50"/>
+              <w:right w:type="dxa" w:w="90"/>
+            </w:tcMar>
+          </w:tcPr>
+          <w:p>
+            <w:r>
+              <w:rPr>
+                <w:sz w:val="19"/>
+                <w:szCs w:val="19"/>
+              </w:rPr>
+              <w:t xml:space="preserve">none (SmartScreen warning on first run)</w:t>
+            </w:r>
+          </w:p>
+        </w:tc>
+        <w:tc>
+          <w:tcPr>
+            <w:tcW w:type="dxa" w:w="3856"/>
+            <w:tcBorders>
+              <w:top w:val="single" w:color="B8C0CC" w:sz="4"/>
+              <w:left w:val="single" w:color="B8C0CC" w:sz="4"/>
+              <w:bottom w:val="single" w:color="B8C0CC" w:sz="4"/>
+              <w:right w:val="single" w:color="B8C0CC" w:sz="4"/>
+            </w:tcBorders>
+            <w:tcMar>
+              <w:top w:type="dxa" w:w="50"/>
+              <w:left w:type="dxa" w:w="90"/>
+              <w:bottom w:type="dxa" w:w="50"/>
+              <w:right w:type="dxa" w:w="90"/>
+            </w:tcMar>
+          </w:tcPr>
+          <w:p>
+            <w:r>
+              <w:rPr>
+                <w:sz w:val="19"/>
+                <w:szCs w:val="19"/>
+              </w:rPr>
+              <w:t xml:space="preserve">none (Gatekeeper check on first run)</w:t>
             </w:r>
           </w:p>
         </w:tc>
@@ -1719,160 +1979,141 @@
     </w:p>
     <w:p>
       <w:pPr>
-        <w:shd w:fill="F2F4F7" w:color="auto" w:val="clear"/>
-        <w:spacing w:after="160" w:before="80" w:line="260"/>
-        <w:ind w:left="120" w:right="120"/>
-      </w:pPr>
+        <w:pStyle w:val="Heading2"/>
+      </w:pPr>
+      <w:bookmarkStart w:name="_Toc48" w:id="48"/>
+      <w:r>
+        <w:t xml:space="preserve">2.1 Windows</w:t>
+      </w:r>
+      <w:bookmarkEnd w:id="48"/>
+    </w:p>
+    <w:p>
+      <w:pPr>
+        <w:pStyle w:val="ListParagraph"/>
+        <w:numPr>
+          <w:ilvl w:val="0"/>
+          <w:numId w:val="4"/>
+        </w:numPr>
+        <w:spacing w:after="60"/>
+      </w:pPr>
+      <w:r>
+        <w:t xml:space="preserve">Double-click </w:t>
+      </w:r>
       <w:r>
         <w:rPr>
           <w:rFonts w:ascii="Consolas" w:cs="Consolas" w:eastAsia="Consolas" w:hAnsi="Consolas"/>
-          <w:sz w:val="18"/>
-          <w:szCs w:val="18"/>
-        </w:rPr>
-        <w:t xml:space="preserve">pip install numpy matplotlib PySide6</w:t>
-      </w:r>
-    </w:p>
-    <w:p>
-      <w:pPr>
-        <w:spacing w:after="120"/>
-      </w:pPr>
-      <w:r>
-        <w:t xml:space="preserve">The directory layout is shown below. Both database directories are scanned at start-up.</w:t>
-      </w:r>
-    </w:p>
-    <w:p>
-      <w:pPr>
-        <w:shd w:fill="F2F4F7" w:color="auto" w:val="clear"/>
-        <w:spacing w:after="0" w:before="80" w:line="260"/>
-        <w:ind w:left="120" w:right="120"/>
-      </w:pPr>
+          <w:color w:val="7A2E00"/>
+          <w:sz w:val="19"/>
+          <w:szCs w:val="19"/>
+        </w:rPr>
+        <w:t xml:space="preserve">METEORAD-&lt;ver&gt;-Windows-x64-Setup.exe</w:t>
+      </w:r>
+      <w:r>
+        <w:t xml:space="preserve">.</w:t>
+      </w:r>
+    </w:p>
+    <w:p>
+      <w:pPr>
+        <w:pStyle w:val="ListParagraph"/>
+        <w:numPr>
+          <w:ilvl w:val="0"/>
+          <w:numId w:val="4"/>
+        </w:numPr>
+        <w:spacing w:after="60"/>
+      </w:pPr>
+      <w:r>
+        <w:t xml:space="preserve">If "Windows protected your PC" appears, choose </w:t>
+      </w:r>
+      <w:r>
+        <w:rPr>
+          <w:b/>
+          <w:bCs/>
+        </w:rPr>
+        <w:t xml:space="preserve">More info</w:t>
+      </w:r>
+      <w:r>
+        <w:t xml:space="preserve"> → </w:t>
+      </w:r>
+      <w:r>
+        <w:rPr>
+          <w:b/>
+          <w:bCs/>
+        </w:rPr>
+        <w:t xml:space="preserve">Run anyway</w:t>
+      </w:r>
+      <w:r>
+        <w:t xml:space="preserve"> (the installer is not code-signed).</w:t>
+      </w:r>
+    </w:p>
+    <w:p>
+      <w:pPr>
+        <w:pStyle w:val="ListParagraph"/>
+        <w:numPr>
+          <w:ilvl w:val="0"/>
+          <w:numId w:val="4"/>
+        </w:numPr>
+        <w:spacing w:after="60"/>
+      </w:pPr>
+      <w:r>
+        <w:t xml:space="preserve">Choose the install mode (only for me / all users). Installing for all users requires administrator rights.</w:t>
+      </w:r>
+    </w:p>
+    <w:p>
+      <w:pPr>
+        <w:pStyle w:val="ListParagraph"/>
+        <w:numPr>
+          <w:ilvl w:val="0"/>
+          <w:numId w:val="4"/>
+        </w:numPr>
+        <w:spacing w:after="60"/>
+      </w:pPr>
+      <w:r>
+        <w:t xml:space="preserve">Accept the terms of use, choose the destination (default </w:t>
+      </w:r>
       <w:r>
         <w:rPr>
           <w:rFonts w:ascii="Consolas" w:cs="Consolas" w:eastAsia="Consolas" w:hAnsi="Consolas"/>
-          <w:sz w:val="18"/>
-          <w:szCs w:val="18"/>
-        </w:rPr>
-        <w:t xml:space="preserve">SPRADIAN/</w:t>
-      </w:r>
-    </w:p>
-    <w:p>
-      <w:pPr>
-        <w:shd w:fill="F2F4F7" w:color="auto" w:val="clear"/>
-        <w:spacing w:after="0" w:before="0" w:line="260"/>
-        <w:ind w:left="120" w:right="120"/>
-      </w:pPr>
-      <w:r>
-        <w:rPr>
-          <w:rFonts w:ascii="Consolas" w:cs="Consolas" w:eastAsia="Consolas" w:hAnsi="Consolas"/>
-          <w:sz w:val="18"/>
-          <w:szCs w:val="18"/>
-        </w:rPr>
-        <w:t xml:space="preserve">├── SPRADIAN-1.8/DATAPAC/database/   # original air/combustion .dat files (23 species)</w:t>
-      </w:r>
-    </w:p>
-    <w:p>
-      <w:pPr>
-        <w:shd w:fill="F2F4F7" w:color="auto" w:val="clear"/>
-        <w:spacing w:after="0" w:before="0" w:line="260"/>
-        <w:ind w:left="120" w:right="120"/>
-      </w:pPr>
-      <w:r>
-        <w:rPr>
-          <w:rFonts w:ascii="Consolas" w:cs="Consolas" w:eastAsia="Consolas" w:hAnsi="Consolas"/>
-          <w:sz w:val="18"/>
-          <w:szCs w:val="18"/>
-        </w:rPr>
-        <w:t xml:space="preserve">└── meteorad_py/</w:t>
-      </w:r>
-    </w:p>
-    <w:p>
-      <w:pPr>
-        <w:shd w:fill="F2F4F7" w:color="auto" w:val="clear"/>
-        <w:spacing w:after="0" w:before="0" w:line="260"/>
-        <w:ind w:left="120" w:right="120"/>
-      </w:pPr>
-      <w:r>
-        <w:rPr>
-          <w:rFonts w:ascii="Consolas" w:cs="Consolas" w:eastAsia="Consolas" w:hAnsi="Consolas"/>
-          <w:sz w:val="18"/>
-          <w:szCs w:val="18"/>
-        </w:rPr>
-        <w:t xml:space="preserve">    ├── meteorad/                    # computational core (port of RADIPAC)</w:t>
-      </w:r>
-    </w:p>
-    <w:p>
-      <w:pPr>
-        <w:shd w:fill="F2F4F7" w:color="auto" w:val="clear"/>
-        <w:spacing w:after="0" w:before="0" w:line="260"/>
-        <w:ind w:left="120" w:right="120"/>
-      </w:pPr>
-      <w:r>
-        <w:rPr>
-          <w:rFonts w:ascii="Consolas" w:cs="Consolas" w:eastAsia="Consolas" w:hAnsi="Consolas"/>
-          <w:sz w:val="18"/>
-          <w:szCs w:val="18"/>
-        </w:rPr>
-        <w:t xml:space="preserve">    ├── meteorad_gui/                # PySide6 GUI</w:t>
-      </w:r>
-    </w:p>
-    <w:p>
-      <w:pPr>
-        <w:shd w:fill="F2F4F7" w:color="auto" w:val="clear"/>
-        <w:spacing w:after="0" w:before="0" w:line="260"/>
-        <w:ind w:left="120" w:right="120"/>
-      </w:pPr>
-      <w:r>
-        <w:rPr>
-          <w:rFonts w:ascii="Consolas" w:cs="Consolas" w:eastAsia="Consolas" w:hAnsi="Consolas"/>
-          <w:sz w:val="18"/>
-          <w:szCs w:val="18"/>
-        </w:rPr>
-        <w:t xml:space="preserve">    ├── database_debris/             # debris/metal .dat files (20 species) / VALD target</w:t>
-      </w:r>
-    </w:p>
-    <w:p>
-      <w:pPr>
-        <w:shd w:fill="F2F4F7" w:color="auto" w:val="clear"/>
-        <w:spacing w:after="0" w:before="0" w:line="260"/>
-        <w:ind w:left="120" w:right="120"/>
-      </w:pPr>
-      <w:r>
-        <w:rPr>
-          <w:rFonts w:ascii="Consolas" w:cs="Consolas" w:eastAsia="Consolas" w:hAnsi="Consolas"/>
-          <w:sz w:val="18"/>
-          <w:szCs w:val="18"/>
-        </w:rPr>
-        <w:t xml:space="preserve">    ├── tools/                       # .dat generators and tests</w:t>
-      </w:r>
-    </w:p>
-    <w:p>
-      <w:pPr>
-        <w:shd w:fill="F2F4F7" w:color="auto" w:val="clear"/>
-        <w:spacing w:after="0" w:before="0" w:line="260"/>
-        <w:ind w:left="120" w:right="120"/>
-      </w:pPr>
-      <w:r>
-        <w:rPr>
-          <w:rFonts w:ascii="Consolas" w:cs="Consolas" w:eastAsia="Consolas" w:hAnsi="Consolas"/>
-          <w:sz w:val="18"/>
-          <w:szCs w:val="18"/>
-        </w:rPr>
-        <w:t xml:space="preserve">    ├── notes/                       # port notes, data sources, verification</w:t>
-      </w:r>
-    </w:p>
-    <w:p>
-      <w:pPr>
-        <w:shd w:fill="F2F4F7" w:color="auto" w:val="clear"/>
-        <w:spacing w:after="160" w:before="0" w:line="260"/>
-        <w:ind w:left="120" w:right="120"/>
-      </w:pPr>
-      <w:r>
-        <w:rPr>
-          <w:rFonts w:ascii="Consolas" w:cs="Consolas" w:eastAsia="Consolas" w:hAnsi="Consolas"/>
-          <w:sz w:val="18"/>
-          <w:szCs w:val="18"/>
-        </w:rPr>
-        <w:t xml:space="preserve">    └── run_gui.py                   # GUI launcher</w:t>
+          <w:color w:val="7A2E00"/>
+          <w:sz w:val="19"/>
+          <w:szCs w:val="19"/>
+        </w:rPr>
+        <w:t xml:space="preserve">C:\Program Files\METEORAD</w:t>
+      </w:r>
+      <w:r>
+        <w:t xml:space="preserve">) and whether to create a desktop icon, then click </w:t>
+      </w:r>
+      <w:r>
+        <w:rPr>
+          <w:b/>
+          <w:bCs/>
+        </w:rPr>
+        <w:t xml:space="preserve">Install</w:t>
+      </w:r>
+      <w:r>
+        <w:t xml:space="preserve">.</w:t>
+      </w:r>
+    </w:p>
+    <w:p>
+      <w:pPr>
+        <w:pStyle w:val="ListParagraph"/>
+        <w:numPr>
+          <w:ilvl w:val="0"/>
+          <w:numId w:val="4"/>
+        </w:numPr>
+        <w:spacing w:after="60"/>
+      </w:pPr>
+      <w:r>
+        <w:t xml:space="preserve">Leave "Launch METEORAD" checked on the last page and click </w:t>
+      </w:r>
+      <w:r>
+        <w:rPr>
+          <w:b/>
+          <w:bCs/>
+        </w:rPr>
+        <w:t xml:space="preserve">Finish</w:t>
+      </w:r>
+      <w:r>
+        <w:t xml:space="preserve"> to start it.</w:t>
       </w:r>
     </w:p>
     <w:p>
@@ -1885,16 +2126,42 @@
         <w:ind w:left="120"/>
       </w:pPr>
       <w:r>
+        <w:t xml:space="preserve">To use the portable version, extract the zip anywhere and run </w:t>
+      </w:r>
+      <w:r>
         <w:rPr>
           <w:rFonts w:ascii="Consolas" w:cs="Consolas" w:eastAsia="Consolas" w:hAnsi="Consolas"/>
           <w:color w:val="7A2E00"/>
           <w:sz w:val="19"/>
           <w:szCs w:val="19"/>
         </w:rPr>
-        <w:t xml:space="preserve">SPR-*</w:t>
-      </w:r>
-      <w:r>
-        <w:t xml:space="preserve"> working files and </w:t>
+        <w:t xml:space="preserve">METEORAD\METEORAD.exe</w:t>
+      </w:r>
+      <w:r>
+        <w:t xml:space="preserve">; no installation is needed.</w:t>
+      </w:r>
+    </w:p>
+    <w:p>
+      <w:pPr>
+        <w:pStyle w:val="Heading2"/>
+      </w:pPr>
+      <w:bookmarkStart w:name="_Toc49" w:id="49"/>
+      <w:r>
+        <w:t xml:space="preserve">2.2 macOS</w:t>
+      </w:r>
+      <w:bookmarkEnd w:id="49"/>
+    </w:p>
+    <w:p>
+      <w:pPr>
+        <w:pStyle w:val="ListParagraph"/>
+        <w:numPr>
+          <w:ilvl w:val="0"/>
+          <w:numId w:val="5"/>
+        </w:numPr>
+        <w:spacing w:after="60"/>
+      </w:pPr>
+      <w:r>
+        <w:t xml:space="preserve">Double-click </w:t>
       </w:r>
       <w:r>
         <w:rPr>
@@ -1903,10 +2170,579 @@
           <w:sz w:val="19"/>
           <w:szCs w:val="19"/>
         </w:rPr>
-        <w:t xml:space="preserve">*.org</w:t>
-      </w:r>
-      <w:r>
-        <w:t xml:space="preserve"> / </w:t>
+        <w:t xml:space="preserve">METEORAD-&lt;ver&gt;-macOS-arm64.dmg</w:t>
+      </w:r>
+      <w:r>
+        <w:t xml:space="preserve"> to open it.</w:t>
+      </w:r>
+    </w:p>
+    <w:p>
+      <w:pPr>
+        <w:pStyle w:val="ListParagraph"/>
+        <w:numPr>
+          <w:ilvl w:val="0"/>
+          <w:numId w:val="5"/>
+        </w:numPr>
+        <w:spacing w:after="60"/>
+      </w:pPr>
+      <w:r>
+        <w:t xml:space="preserve">Drag </w:t>
+      </w:r>
+      <w:r>
+        <w:rPr>
+          <w:b/>
+          <w:bCs/>
+        </w:rPr>
+        <w:t xml:space="preserve">METEORAD.app</w:t>
+      </w:r>
+      <w:r>
+        <w:t xml:space="preserve"> onto the </w:t>
+      </w:r>
+      <w:r>
+        <w:rPr>
+          <w:b/>
+          <w:bCs/>
+        </w:rPr>
+        <w:t xml:space="preserve">Applications</w:t>
+      </w:r>
+      <w:r>
+        <w:t xml:space="preserve"> folder shown in the same window.</w:t>
+      </w:r>
+    </w:p>
+    <w:p>
+      <w:pPr>
+        <w:pStyle w:val="ListParagraph"/>
+        <w:numPr>
+          <w:ilvl w:val="0"/>
+          <w:numId w:val="5"/>
+        </w:numPr>
+        <w:spacing w:after="60"/>
+      </w:pPr>
+      <w:r>
+        <w:t xml:space="preserve">Open METEORAD from the Applications folder (or Launchpad). The first time, macOS reports that it cannot verify the developer; close the dialog with </w:t>
+      </w:r>
+      <w:r>
+        <w:rPr>
+          <w:b/>
+          <w:bCs/>
+        </w:rPr>
+        <w:t xml:space="preserve">Done</w:t>
+      </w:r>
+      <w:r>
+        <w:t xml:space="preserve"> (or </w:t>
+      </w:r>
+      <w:r>
+        <w:rPr>
+          <w:b/>
+          <w:bCs/>
+        </w:rPr>
+        <w:t xml:space="preserve">OK</w:t>
+      </w:r>
+      <w:r>
+        <w:t xml:space="preserve">).</w:t>
+      </w:r>
+    </w:p>
+    <w:p>
+      <w:pPr>
+        <w:pStyle w:val="ListParagraph"/>
+        <w:numPr>
+          <w:ilvl w:val="0"/>
+          <w:numId w:val="5"/>
+        </w:numPr>
+        <w:spacing w:after="60"/>
+      </w:pPr>
+      <w:r>
+        <w:t xml:space="preserve">Open </w:t>
+      </w:r>
+      <w:r>
+        <w:rPr>
+          <w:b/>
+          <w:bCs/>
+        </w:rPr>
+        <w:t xml:space="preserve">System Settings</w:t>
+      </w:r>
+      <w:r>
+        <w:t xml:space="preserve"> → </w:t>
+      </w:r>
+      <w:r>
+        <w:rPr>
+          <w:b/>
+          <w:bCs/>
+        </w:rPr>
+        <w:t xml:space="preserve">Privacy &amp; Security</w:t>
+      </w:r>
+      <w:r>
+        <w:t xml:space="preserve">, click </w:t>
+      </w:r>
+      <w:r>
+        <w:rPr>
+          <w:b/>
+          <w:bCs/>
+        </w:rPr>
+        <w:t xml:space="preserve">Open Anyway</w:t>
+      </w:r>
+      <w:r>
+        <w:t xml:space="preserve"> next to the message that "METEORAD" was blocked, and confirm with </w:t>
+      </w:r>
+      <w:r>
+        <w:rPr>
+          <w:b/>
+          <w:bCs/>
+        </w:rPr>
+        <w:t xml:space="preserve">Open</w:t>
+      </w:r>
+      <w:r>
+        <w:t xml:space="preserve"> (only needed once).</w:t>
+      </w:r>
+    </w:p>
+    <w:p>
+      <w:pPr>
+        <w:pStyle w:val="ListParagraph"/>
+        <w:numPr>
+          <w:ilvl w:val="0"/>
+          <w:numId w:val="5"/>
+        </w:numPr>
+        <w:spacing w:after="60"/>
+      </w:pPr>
+      <w:r>
+        <w:t xml:space="preserve">You can then eject the dmg from the Finder sidebar.</w:t>
+      </w:r>
+    </w:p>
+    <w:p>
+      <w:pPr>
+        <w:pStyle w:val="Heading2"/>
+      </w:pPr>
+      <w:bookmarkStart w:name="_Toc50" w:id="50"/>
+      <w:r>
+        <w:t xml:space="preserve">2.3 Where the databases are stored</w:t>
+      </w:r>
+      <w:bookmarkEnd w:id="50"/>
+    </w:p>
+    <w:p>
+      <w:pPr>
+        <w:spacing w:after="120"/>
+      </w:pPr>
+      <w:r>
+        <w:t xml:space="preserve">Two databases are scanned at start-up and listed in the species panel.</w:t>
+      </w:r>
+    </w:p>
+    <w:p>
+      <w:pPr>
+        <w:keepNext/>
+        <w:spacing w:after="60" w:before="120"/>
+      </w:pPr>
+      <w:r>
+        <w:rPr>
+          <w:b/>
+          <w:bCs/>
+          <w:sz w:val="19"/>
+          <w:szCs w:val="19"/>
+        </w:rPr>
+        <w:t xml:space="preserve">Table 2. </w:t>
+      </w:r>
+      <w:r>
+        <w:rPr>
+          <w:sz w:val="19"/>
+          <w:szCs w:val="19"/>
+        </w:rPr>
+        <w:t xml:space="preserve">Database locations</w:t>
+      </w:r>
+    </w:p>
+    <w:tbl>
+      <w:tblPr>
+        <w:tblW w:type="dxa" w:w="9638"/>
+        <w:tblBorders>
+          <w:top w:val="single" w:color="auto" w:sz="4"/>
+          <w:left w:val="single" w:color="auto" w:sz="4"/>
+          <w:bottom w:val="single" w:color="auto" w:sz="4"/>
+          <w:right w:val="single" w:color="auto" w:sz="4"/>
+          <w:insideH w:val="single" w:color="auto" w:sz="4"/>
+          <w:insideV w:val="single" w:color="auto" w:sz="4"/>
+        </w:tblBorders>
+      </w:tblPr>
+      <w:tblGrid>
+        <w:gridCol w:w="1927"/>
+        <w:gridCol w:w="4337"/>
+        <w:gridCol w:w="3374"/>
+      </w:tblGrid>
+      <w:tr>
+        <w:trPr>
+          <w:tblHeader/>
+        </w:trPr>
+        <w:tc>
+          <w:tcPr>
+            <w:tcW w:type="dxa" w:w="1927"/>
+            <w:tcBorders>
+              <w:top w:val="single" w:color="B8C0CC" w:sz="4"/>
+              <w:left w:val="single" w:color="B8C0CC" w:sz="4"/>
+              <w:bottom w:val="single" w:color="B8C0CC" w:sz="4"/>
+              <w:right w:val="single" w:color="B8C0CC" w:sz="4"/>
+            </w:tcBorders>
+            <w:shd w:fill="1F3A5F" w:color="auto" w:val="clear"/>
+            <w:tcMar>
+              <w:top w:type="dxa" w:w="50"/>
+              <w:left w:type="dxa" w:w="90"/>
+              <w:bottom w:type="dxa" w:w="50"/>
+              <w:right w:type="dxa" w:w="90"/>
+            </w:tcMar>
+          </w:tcPr>
+          <w:p>
+            <w:r>
+              <w:rPr>
+                <w:b/>
+                <w:bCs/>
+                <w:color w:val="FFFFFF"/>
+                <w:sz w:val="19"/>
+                <w:szCs w:val="19"/>
+              </w:rPr>
+              <w:t xml:space="preserve">Group</w:t>
+            </w:r>
+          </w:p>
+        </w:tc>
+        <w:tc>
+          <w:tcPr>
+            <w:tcW w:type="dxa" w:w="4337"/>
+            <w:tcBorders>
+              <w:top w:val="single" w:color="B8C0CC" w:sz="4"/>
+              <w:left w:val="single" w:color="B8C0CC" w:sz="4"/>
+              <w:bottom w:val="single" w:color="B8C0CC" w:sz="4"/>
+              <w:right w:val="single" w:color="B8C0CC" w:sz="4"/>
+            </w:tcBorders>
+            <w:shd w:fill="1F3A5F" w:color="auto" w:val="clear"/>
+            <w:tcMar>
+              <w:top w:type="dxa" w:w="50"/>
+              <w:left w:type="dxa" w:w="90"/>
+              <w:bottom w:type="dxa" w:w="50"/>
+              <w:right w:type="dxa" w:w="90"/>
+            </w:tcMar>
+          </w:tcPr>
+          <w:p>
+            <w:r>
+              <w:rPr>
+                <w:b/>
+                <w:bCs/>
+                <w:color w:val="FFFFFF"/>
+                <w:sz w:val="19"/>
+                <w:szCs w:val="19"/>
+              </w:rPr>
+              <w:t xml:space="preserve">Location</w:t>
+            </w:r>
+          </w:p>
+        </w:tc>
+        <w:tc>
+          <w:tcPr>
+            <w:tcW w:type="dxa" w:w="3374"/>
+            <w:tcBorders>
+              <w:top w:val="single" w:color="B8C0CC" w:sz="4"/>
+              <w:left w:val="single" w:color="B8C0CC" w:sz="4"/>
+              <w:bottom w:val="single" w:color="B8C0CC" w:sz="4"/>
+              <w:right w:val="single" w:color="B8C0CC" w:sz="4"/>
+            </w:tcBorders>
+            <w:shd w:fill="1F3A5F" w:color="auto" w:val="clear"/>
+            <w:tcMar>
+              <w:top w:type="dxa" w:w="50"/>
+              <w:left w:type="dxa" w:w="90"/>
+              <w:bottom w:type="dxa" w:w="50"/>
+              <w:right w:type="dxa" w:w="90"/>
+            </w:tcMar>
+          </w:tcPr>
+          <w:p>
+            <w:r>
+              <w:rPr>
+                <w:b/>
+                <w:bCs/>
+                <w:color w:val="FFFFFF"/>
+                <w:sz w:val="19"/>
+                <w:szCs w:val="19"/>
+              </w:rPr>
+              <w:t xml:space="preserve">Contents</w:t>
+            </w:r>
+          </w:p>
+        </w:tc>
+      </w:tr>
+      <w:tr>
+        <w:tc>
+          <w:tcPr>
+            <w:tcW w:type="dxa" w:w="1927"/>
+            <w:tcBorders>
+              <w:top w:val="single" w:color="B8C0CC" w:sz="4"/>
+              <w:left w:val="single" w:color="B8C0CC" w:sz="4"/>
+              <w:bottom w:val="single" w:color="B8C0CC" w:sz="4"/>
+              <w:right w:val="single" w:color="B8C0CC" w:sz="4"/>
+            </w:tcBorders>
+            <w:tcMar>
+              <w:top w:type="dxa" w:w="50"/>
+              <w:left w:type="dxa" w:w="90"/>
+              <w:bottom w:type="dxa" w:w="50"/>
+              <w:right w:type="dxa" w:w="90"/>
+            </w:tcMar>
+          </w:tcPr>
+          <w:p>
+            <w:r>
+              <w:rPr>
+                <w:sz w:val="19"/>
+                <w:szCs w:val="19"/>
+              </w:rPr>
+              <w:t xml:space="preserve">Air/Combustion</w:t>
+            </w:r>
+          </w:p>
+        </w:tc>
+        <w:tc>
+          <w:tcPr>
+            <w:tcW w:type="dxa" w:w="4337"/>
+            <w:tcBorders>
+              <w:top w:val="single" w:color="B8C0CC" w:sz="4"/>
+              <w:left w:val="single" w:color="B8C0CC" w:sz="4"/>
+              <w:bottom w:val="single" w:color="B8C0CC" w:sz="4"/>
+              <w:right w:val="single" w:color="B8C0CC" w:sz="4"/>
+            </w:tcBorders>
+            <w:tcMar>
+              <w:top w:type="dxa" w:w="50"/>
+              <w:left w:type="dxa" w:w="90"/>
+              <w:bottom w:type="dxa" w:w="50"/>
+              <w:right w:type="dxa" w:w="90"/>
+            </w:tcMar>
+          </w:tcPr>
+          <w:p>
+            <w:r>
+              <w:rPr>
+                <w:sz w:val="19"/>
+                <w:szCs w:val="19"/>
+              </w:rPr>
+              <w:t xml:space="preserve">inside the application (read-only)</w:t>
+            </w:r>
+          </w:p>
+        </w:tc>
+        <w:tc>
+          <w:tcPr>
+            <w:tcW w:type="dxa" w:w="3374"/>
+            <w:tcBorders>
+              <w:top w:val="single" w:color="B8C0CC" w:sz="4"/>
+              <w:left w:val="single" w:color="B8C0CC" w:sz="4"/>
+              <w:bottom w:val="single" w:color="B8C0CC" w:sz="4"/>
+              <w:right w:val="single" w:color="B8C0CC" w:sz="4"/>
+            </w:tcBorders>
+            <w:tcMar>
+              <w:top w:type="dxa" w:w="50"/>
+              <w:left w:type="dxa" w:w="90"/>
+              <w:bottom w:type="dxa" w:w="50"/>
+              <w:right w:type="dxa" w:w="90"/>
+            </w:tcMar>
+          </w:tcPr>
+          <w:p>
+            <w:r>
+              <w:rPr>
+                <w:sz w:val="19"/>
+                <w:szCs w:val="19"/>
+              </w:rPr>
+              <w:t xml:space="preserve">23 air/combustion species of the original SPRADIAN DATAPAC</w:t>
+            </w:r>
+          </w:p>
+        </w:tc>
+      </w:tr>
+      <w:tr>
+        <w:tc>
+          <w:tcPr>
+            <w:tcW w:type="dxa" w:w="1927"/>
+            <w:tcBorders>
+              <w:top w:val="single" w:color="B8C0CC" w:sz="4"/>
+              <w:left w:val="single" w:color="B8C0CC" w:sz="4"/>
+              <w:bottom w:val="single" w:color="B8C0CC" w:sz="4"/>
+              <w:right w:val="single" w:color="B8C0CC" w:sz="4"/>
+            </w:tcBorders>
+            <w:tcMar>
+              <w:top w:type="dxa" w:w="50"/>
+              <w:left w:type="dxa" w:w="90"/>
+              <w:bottom w:type="dxa" w:w="50"/>
+              <w:right w:type="dxa" w:w="90"/>
+            </w:tcMar>
+          </w:tcPr>
+          <w:p>
+            <w:r>
+              <w:rPr>
+                <w:sz w:val="19"/>
+                <w:szCs w:val="19"/>
+              </w:rPr>
+              <w:t xml:space="preserve">Debris/Metal</w:t>
+            </w:r>
+          </w:p>
+        </w:tc>
+        <w:tc>
+          <w:tcPr>
+            <w:tcW w:type="dxa" w:w="4337"/>
+            <w:tcBorders>
+              <w:top w:val="single" w:color="B8C0CC" w:sz="4"/>
+              <w:left w:val="single" w:color="B8C0CC" w:sz="4"/>
+              <w:bottom w:val="single" w:color="B8C0CC" w:sz="4"/>
+              <w:right w:val="single" w:color="B8C0CC" w:sz="4"/>
+            </w:tcBorders>
+            <w:tcMar>
+              <w:top w:type="dxa" w:w="50"/>
+              <w:left w:type="dxa" w:w="90"/>
+              <w:bottom w:type="dxa" w:w="50"/>
+              <w:right w:type="dxa" w:w="90"/>
+            </w:tcMar>
+          </w:tcPr>
+          <w:p>
+            <w:r>
+              <w:rPr>
+                <w:sz w:val="19"/>
+                <w:szCs w:val="19"/>
+              </w:rPr>
+              <w:t xml:space="preserve">Windows: </w:t>
+            </w:r>
+            <w:r>
+              <w:rPr>
+                <w:rFonts w:ascii="Consolas" w:cs="Consolas" w:eastAsia="Consolas" w:hAnsi="Consolas"/>
+                <w:color w:val="7A2E00"/>
+                <w:sz w:val="19"/>
+                <w:szCs w:val="19"/>
+              </w:rPr>
+              <w:t xml:space="preserve">%APPDATA%\METEORAD\database_debris</w:t>
+            </w:r>
+          </w:p>
+          <w:p>
+            <w:r>
+              <w:rPr>
+                <w:sz w:val="19"/>
+                <w:szCs w:val="19"/>
+              </w:rPr>
+              <w:t xml:space="preserve">macOS: </w:t>
+            </w:r>
+            <w:r>
+              <w:rPr>
+                <w:rFonts w:ascii="Consolas" w:cs="Consolas" w:eastAsia="Consolas" w:hAnsi="Consolas"/>
+                <w:color w:val="7A2E00"/>
+                <w:sz w:val="19"/>
+                <w:szCs w:val="19"/>
+              </w:rPr>
+              <w:t xml:space="preserve">~/Library/Application Support/METEORAD/database_debris</w:t>
+            </w:r>
+          </w:p>
+        </w:tc>
+        <w:tc>
+          <w:tcPr>
+            <w:tcW w:type="dxa" w:w="3374"/>
+            <w:tcBorders>
+              <w:top w:val="single" w:color="B8C0CC" w:sz="4"/>
+              <w:left w:val="single" w:color="B8C0CC" w:sz="4"/>
+              <w:bottom w:val="single" w:color="B8C0CC" w:sz="4"/>
+              <w:right w:val="single" w:color="B8C0CC" w:sz="4"/>
+            </w:tcBorders>
+            <w:tcMar>
+              <w:top w:type="dxa" w:w="50"/>
+              <w:left w:type="dxa" w:w="90"/>
+              <w:bottom w:type="dxa" w:w="50"/>
+              <w:right w:type="dxa" w:w="90"/>
+            </w:tcMar>
+          </w:tcPr>
+          <w:p>
+            <w:r>
+              <w:rPr>
+                <w:sz w:val="19"/>
+                <w:szCs w:val="19"/>
+              </w:rPr>
+              <w:t xml:space="preserve">20 debris/metal species and any species created by VALD import (Chapter 10)</w:t>
+            </w:r>
+          </w:p>
+        </w:tc>
+      </w:tr>
+    </w:tbl>
+    <w:p>
+      <w:pPr>
+        <w:spacing w:after="120"/>
+      </w:pPr>
+    </w:p>
+    <w:p>
+      <w:pPr>
+        <w:pBdr>
+          <w:left w:val="single" w:color="E0A030" w:sz="18" w:space="6"/>
+        </w:pBdr>
+        <w:shd w:fill="FFF6E0" w:color="auto" w:val="clear"/>
+        <w:spacing w:after="160" w:before="60"/>
+        <w:ind w:left="120"/>
+      </w:pPr>
+      <w:r>
+        <w:t xml:space="preserve">The Debris/Metal folder is created automatically on first start and the bundled databases are copied into it. When the application is updated, files with the same names as the bundled ones are overwritten by the new version (other files are kept); if you replaced a bundled species, e.g. by a VALD import, save it under another name or keep a backup. After changing the folder, use </w:t>
+      </w:r>
+      <w:r>
+        <w:rPr>
+          <w:b/>
+          <w:bCs/>
+        </w:rPr>
+        <w:t xml:space="preserve">Tools → Rescan databases</w:t>
+      </w:r>
+      <w:r>
+        <w:t xml:space="preserve"> to refresh the list.</w:t>
+      </w:r>
+    </w:p>
+    <w:p>
+      <w:pPr>
+        <w:pStyle w:val="Heading2"/>
+      </w:pPr>
+      <w:bookmarkStart w:name="_Toc51" w:id="51"/>
+      <w:r>
+        <w:t xml:space="preserve">2.4 Uninstalling</w:t>
+      </w:r>
+      <w:bookmarkEnd w:id="51"/>
+    </w:p>
+    <w:p>
+      <w:pPr>
+        <w:pStyle w:val="ListParagraph"/>
+        <w:numPr>
+          <w:ilvl w:val="0"/>
+          <w:numId w:val="2"/>
+        </w:numPr>
+        <w:spacing w:after="60"/>
+      </w:pPr>
+      <w:r>
+        <w:t xml:space="preserve">Windows: in </w:t>
+      </w:r>
+      <w:r>
+        <w:rPr>
+          <w:b/>
+          <w:bCs/>
+        </w:rPr>
+        <w:t xml:space="preserve">Settings → Apps → Installed apps</w:t>
+      </w:r>
+      <w:r>
+        <w:t xml:space="preserve">, select METEORAD and choose </w:t>
+      </w:r>
+      <w:r>
+        <w:rPr>
+          <w:b/>
+          <w:bCs/>
+        </w:rPr>
+        <w:t xml:space="preserve">Uninstall</w:t>
+      </w:r>
+      <w:r>
+        <w:t xml:space="preserve">.</w:t>
+      </w:r>
+    </w:p>
+    <w:p>
+      <w:pPr>
+        <w:pStyle w:val="ListParagraph"/>
+        <w:numPr>
+          <w:ilvl w:val="0"/>
+          <w:numId w:val="2"/>
+        </w:numPr>
+        <w:spacing w:after="60"/>
+      </w:pPr>
+      <w:r>
+        <w:t xml:space="preserve">macOS: move METEORAD.app from the Applications folder to the Trash.</w:t>
+      </w:r>
+    </w:p>
+    <w:p>
+      <w:pPr>
+        <w:pStyle w:val="ListParagraph"/>
+        <w:numPr>
+          <w:ilvl w:val="0"/>
+          <w:numId w:val="2"/>
+        </w:numPr>
+        <w:spacing w:after="60"/>
+      </w:pPr>
+      <w:r>
+        <w:t xml:space="preserve">In both cases the user data (the Debris/Metal folder above and the settings) is kept; delete the </w:t>
       </w:r>
       <w:r>
         <w:rPr>
@@ -1915,22 +2751,10 @@
           <w:sz w:val="19"/>
           <w:szCs w:val="19"/>
         </w:rPr>
-        <w:t xml:space="preserve">*.orig*</w:t>
-      </w:r>
-      <w:r>
-        <w:t xml:space="preserve"> backups are excluded from the species list. If </w:t>
-      </w:r>
-      <w:r>
-        <w:rPr>
-          <w:rFonts w:ascii="Consolas" w:cs="Consolas" w:eastAsia="Consolas" w:hAnsi="Consolas"/>
-          <w:color w:val="7A2E00"/>
-          <w:sz w:val="19"/>
-          <w:szCs w:val="19"/>
-        </w:rPr>
-        <w:t xml:space="preserve">database_debris/</w:t>
-      </w:r>
-      <w:r>
-        <w:t xml:space="preserve"> is missing, the Debris/Metal group is simply empty.</w:t>
+        <w:t xml:space="preserve">METEORAD</w:t>
+      </w:r>
+      <w:r>
+        <w:t xml:space="preserve"> folder if you no longer need it.</w:t>
       </w:r>
     </w:p>
     <w:p>
@@ -1938,11 +2762,88 @@
         <w:pStyle w:val="Heading1"/>
         <w:pageBreakBefore/>
       </w:pPr>
-      <w:bookmarkStart w:name="_Toc44" w:id="44"/>
+      <w:bookmarkStart w:name="_Toc52" w:id="52"/>
       <w:r>
         <w:t xml:space="preserve">3. Start-up and window layout</w:t>
       </w:r>
-      <w:bookmarkEnd w:id="44"/>
+      <w:bookmarkEnd w:id="52"/>
+    </w:p>
+    <w:p>
+      <w:pPr>
+        <w:pStyle w:val="ListParagraph"/>
+        <w:numPr>
+          <w:ilvl w:val="0"/>
+          <w:numId w:val="2"/>
+        </w:numPr>
+        <w:spacing w:after="60"/>
+      </w:pPr>
+      <w:r>
+        <w:t xml:space="preserve">Windows: start </w:t>
+      </w:r>
+      <w:r>
+        <w:rPr>
+          <w:b/>
+          <w:bCs/>
+        </w:rPr>
+        <w:t xml:space="preserve">METEORAD</w:t>
+      </w:r>
+      <w:r>
+        <w:t xml:space="preserve"> from the Start menu (or the desktop icon).</w:t>
+      </w:r>
+    </w:p>
+    <w:p>
+      <w:pPr>
+        <w:pStyle w:val="ListParagraph"/>
+        <w:numPr>
+          <w:ilvl w:val="0"/>
+          <w:numId w:val="2"/>
+        </w:numPr>
+        <w:spacing w:after="60"/>
+      </w:pPr>
+      <w:r>
+        <w:t xml:space="preserve">macOS: start </w:t>
+      </w:r>
+      <w:r>
+        <w:rPr>
+          <w:b/>
+          <w:bCs/>
+        </w:rPr>
+        <w:t xml:space="preserve">METEORAD</w:t>
+      </w:r>
+      <w:r>
+        <w:t xml:space="preserve"> from the Applications folder or Launchpad.</w:t>
+      </w:r>
+    </w:p>
+    <w:p>
+      <w:pPr>
+        <w:pStyle w:val="ListParagraph"/>
+        <w:numPr>
+          <w:ilvl w:val="0"/>
+          <w:numId w:val="2"/>
+        </w:numPr>
+        <w:spacing w:after="60"/>
+      </w:pPr>
+      <w:r>
+        <w:t xml:space="preserve">SPRADIAN-1.8 control files (.ctl) can be loaded after start-up with </w:t>
+      </w:r>
+      <w:r>
+        <w:rPr>
+          <w:b/>
+          <w:bCs/>
+        </w:rPr>
+        <w:t xml:space="preserve">File → Load control file (.ctl)</w:t>
+      </w:r>
+      <w:r>
+        <w:t xml:space="preserve"> (Chapter 11).</w:t>
+      </w:r>
+    </w:p>
+    <w:p>
+      <w:pPr>
+        <w:spacing w:after="120"/>
+      </w:pPr>
+      <w:r>
+        <w:t xml:space="preserve">Started from a command line, METEORAD can open a .ctl file directly or print its version.</w:t>
+      </w:r>
     </w:p>
     <w:p>
       <w:pPr>
@@ -1956,7 +2857,7 @@
           <w:sz w:val="18"/>
           <w:szCs w:val="18"/>
         </w:rPr>
-        <w:t xml:space="preserve">cd meteorad_py</w:t>
+        <w:t xml:space="preserve"># Windows (PowerShell)</w:t>
       </w:r>
     </w:p>
     <w:p>
@@ -1971,7 +2872,7 @@
           <w:sz w:val="18"/>
           <w:szCs w:val="18"/>
         </w:rPr>
-        <w:t xml:space="preserve">python run_gui.py                                              # empty form</w:t>
+        <w:t xml:space="preserve">&amp; "C:\Program Files\METEORAD\METEORAD.exe" sample1.ctl</w:t>
       </w:r>
     </w:p>
     <w:p>
@@ -1986,7 +2887,37 @@
           <w:sz w:val="18"/>
           <w:szCs w:val="18"/>
         </w:rPr>
-        <w:t xml:space="preserve">python run_gui.py ../SPRADIAN-1.8/RADIPAC/samples/sample1.ctl  # load a .ctl at start-up</w:t>
+        <w:t xml:space="preserve"> </w:t>
+      </w:r>
+    </w:p>
+    <w:p>
+      <w:pPr>
+        <w:shd w:fill="F2F4F7" w:color="auto" w:val="clear"/>
+        <w:spacing w:after="0" w:before="0" w:line="260"/>
+        <w:ind w:left="120" w:right="120"/>
+      </w:pPr>
+      <w:r>
+        <w:rPr>
+          <w:rFonts w:ascii="Consolas" w:cs="Consolas" w:eastAsia="Consolas" w:hAnsi="Consolas"/>
+          <w:sz w:val="18"/>
+          <w:szCs w:val="18"/>
+        </w:rPr>
+        <w:t xml:space="preserve"># macOS (Terminal)</w:t>
+      </w:r>
+    </w:p>
+    <w:p>
+      <w:pPr>
+        <w:shd w:fill="F2F4F7" w:color="auto" w:val="clear"/>
+        <w:spacing w:after="0" w:before="0" w:line="260"/>
+        <w:ind w:left="120" w:right="120"/>
+      </w:pPr>
+      <w:r>
+        <w:rPr>
+          <w:rFonts w:ascii="Consolas" w:cs="Consolas" w:eastAsia="Consolas" w:hAnsi="Consolas"/>
+          <w:sz w:val="18"/>
+          <w:szCs w:val="18"/>
+        </w:rPr>
+        <w:t xml:space="preserve">/Applications/METEORAD.app/Contents/MacOS/METEORAD sample1.ctl</w:t>
       </w:r>
     </w:p>
     <w:p>
@@ -2001,7 +2932,7 @@
           <w:sz w:val="18"/>
           <w:szCs w:val="18"/>
         </w:rPr>
-        <w:t xml:space="preserve">python run_gui.py --version</w:t>
+        <w:t xml:space="preserve">/Applications/METEORAD.app/Contents/MacOS/METEORAD --version</w:t>
       </w:r>
     </w:p>
     <w:p>
@@ -2009,7 +2940,7 @@
         <w:spacing w:after="120"/>
       </w:pPr>
       <w:r>
-        <w:t xml:space="preserve">If a required package is missing, the launcher prints its name and the pip command. The main window has four areas (Figure 1).</w:t>
+        <w:t xml:space="preserve">The main window has four areas (Figure 1).</w:t>
       </w:r>
     </w:p>
     <w:p>
@@ -2093,7 +3024,7 @@
           <w:sz w:val="19"/>
           <w:szCs w:val="19"/>
         </w:rPr>
-        <w:t xml:space="preserve">Table 2. </w:t>
+        <w:t xml:space="preserve">Table 3. </w:t>
       </w:r>
       <w:r>
         <w:rPr>
@@ -2546,11 +3477,11 @@
         <w:pStyle w:val="Heading1"/>
         <w:pageBreakBefore/>
       </w:pPr>
-      <w:bookmarkStart w:name="_Toc45" w:id="45"/>
+      <w:bookmarkStart w:name="_Toc53" w:id="53"/>
       <w:r>
         <w:t xml:space="preserve">4. Species panel</w:t>
       </w:r>
-      <w:bookmarkEnd w:id="45"/>
+      <w:bookmarkEnd w:id="53"/>
     </w:p>
     <w:p>
       <w:pPr>
@@ -2792,11 +3723,11 @@
       <w:pPr>
         <w:pStyle w:val="Heading2"/>
       </w:pPr>
-      <w:bookmarkStart w:name="_Toc46" w:id="46"/>
+      <w:bookmarkStart w:name="_Toc54" w:id="54"/>
       <w:r>
         <w:t xml:space="preserve">4.1 Presets</w:t>
       </w:r>
-      <w:bookmarkEnd w:id="46"/>
+      <w:bookmarkEnd w:id="54"/>
     </w:p>
     <w:p>
       <w:pPr>
@@ -2818,7 +3749,7 @@
           <w:sz w:val="19"/>
           <w:szCs w:val="19"/>
         </w:rPr>
-        <w:t xml:space="preserve">Table 3. </w:t>
+        <w:t xml:space="preserve">Table 4. </w:t>
       </w:r>
       <w:r>
         <w:rPr>
@@ -3284,11 +4215,11 @@
         <w:pStyle w:val="Heading1"/>
         <w:pageBreakBefore/>
       </w:pPr>
-      <w:bookmarkStart w:name="_Toc47" w:id="47"/>
+      <w:bookmarkStart w:name="_Toc55" w:id="55"/>
       <w:r>
         <w:t xml:space="preserve">5. Parameter panel</w:t>
       </w:r>
-      <w:bookmarkEnd w:id="47"/>
+      <w:bookmarkEnd w:id="55"/>
     </w:p>
     <w:p>
       <w:pPr>
@@ -3371,7 +4302,7 @@
           <w:sz w:val="19"/>
           <w:szCs w:val="19"/>
         </w:rPr>
-        <w:t xml:space="preserve">Table 4. </w:t>
+        <w:t xml:space="preserve">Table 5. </w:t>
       </w:r>
       <w:r>
         <w:rPr>
@@ -4311,7 +5242,7 @@
           <w:sz w:val="19"/>
           <w:szCs w:val="19"/>
         </w:rPr>
-        <w:t xml:space="preserve">Table 5. </w:t>
+        <w:t xml:space="preserve">Table 6. </w:t>
       </w:r>
       <w:r>
         <w:rPr>
@@ -4843,11 +5774,11 @@
       <w:pPr>
         <w:pStyle w:val="Heading2"/>
       </w:pPr>
-      <w:bookmarkStart w:name="_Toc48" w:id="48"/>
+      <w:bookmarkStart w:name="_Toc56" w:id="56"/>
       <w:r>
         <w:t xml:space="preserve">5.1 Automatic pressure FWHM (Auto)</w:t>
       </w:r>
-      <w:bookmarkEnd w:id="48"/>
+      <w:bookmarkEnd w:id="56"/>
     </w:p>
     <w:p>
       <w:pPr>
@@ -4905,28 +5836,28 @@
         <w:pStyle w:val="Heading1"/>
         <w:pageBreakBefore/>
       </w:pPr>
-      <w:bookmarkStart w:name="_Toc49" w:id="49"/>
+      <w:bookmarkStart w:name="_Toc57" w:id="57"/>
       <w:r>
         <w:t xml:space="preserve">6. Running and displaying spectra</w:t>
       </w:r>
-      <w:bookmarkEnd w:id="49"/>
+      <w:bookmarkEnd w:id="57"/>
     </w:p>
     <w:p>
       <w:pPr>
         <w:pStyle w:val="Heading2"/>
       </w:pPr>
-      <w:bookmarkStart w:name="_Toc50" w:id="50"/>
+      <w:bookmarkStart w:name="_Toc58" w:id="58"/>
       <w:r>
         <w:t xml:space="preserve">6.1 Basic procedure</w:t>
       </w:r>
-      <w:bookmarkEnd w:id="50"/>
+      <w:bookmarkEnd w:id="58"/>
     </w:p>
     <w:p>
       <w:pPr>
         <w:pStyle w:val="ListParagraph"/>
         <w:numPr>
           <w:ilvl w:val="0"/>
-          <w:numId w:val="4"/>
+          <w:numId w:val="6"/>
         </w:numPr>
         <w:spacing w:after="60"/>
       </w:pPr>
@@ -4939,7 +5870,7 @@
         <w:pStyle w:val="ListParagraph"/>
         <w:numPr>
           <w:ilvl w:val="0"/>
-          <w:numId w:val="4"/>
+          <w:numId w:val="6"/>
         </w:numPr>
         <w:spacing w:after="60"/>
       </w:pPr>
@@ -4952,7 +5883,7 @@
         <w:pStyle w:val="ListParagraph"/>
         <w:numPr>
           <w:ilvl w:val="0"/>
-          <w:numId w:val="4"/>
+          <w:numId w:val="6"/>
         </w:numPr>
         <w:spacing w:after="60"/>
       </w:pPr>
@@ -4975,7 +5906,7 @@
         <w:pStyle w:val="ListParagraph"/>
         <w:numPr>
           <w:ilvl w:val="0"/>
-          <w:numId w:val="4"/>
+          <w:numId w:val="6"/>
         </w:numPr>
         <w:spacing w:after="60"/>
       </w:pPr>
@@ -5056,11 +5987,11 @@
       <w:pPr>
         <w:pStyle w:val="Heading2"/>
       </w:pPr>
-      <w:bookmarkStart w:name="_Toc51" w:id="51"/>
+      <w:bookmarkStart w:name="_Toc59" w:id="59"/>
       <w:r>
         <w:t xml:space="preserve">6.2 Plot-panel controls</w:t>
       </w:r>
-      <w:bookmarkEnd w:id="51"/>
+      <w:bookmarkEnd w:id="59"/>
     </w:p>
     <w:p>
       <w:pPr>
@@ -5074,7 +6005,7 @@
           <w:sz w:val="19"/>
           <w:szCs w:val="19"/>
         </w:rPr>
-        <w:t xml:space="preserve">Table 6. </w:t>
+        <w:t xml:space="preserve">Table 7. </w:t>
       </w:r>
       <w:r>
         <w:rPr>
@@ -5799,11 +6730,11 @@
       <w:pPr>
         <w:pStyle w:val="Heading2"/>
       </w:pPr>
-      <w:bookmarkStart w:name="_Toc52" w:id="52"/>
+      <w:bookmarkStart w:name="_Toc60" w:id="60"/>
       <w:r>
         <w:t xml:space="preserve">6.3 Slab intensity</w:t>
       </w:r>
-      <w:bookmarkEnd w:id="52"/>
+      <w:bookmarkEnd w:id="60"/>
     </w:p>
     <w:p>
       <w:pPr>
@@ -5917,11 +6848,11 @@
         <w:pStyle w:val="Heading1"/>
         <w:pageBreakBefore/>
       </w:pPr>
-      <w:bookmarkStart w:name="_Toc53" w:id="53"/>
+      <w:bookmarkStart w:name="_Toc61" w:id="61"/>
       <w:r>
         <w:t xml:space="preserve">7. Menus</w:t>
       </w:r>
-      <w:bookmarkEnd w:id="53"/>
+      <w:bookmarkEnd w:id="61"/>
     </w:p>
     <w:p>
       <w:pPr>
@@ -6004,7 +6935,7 @@
           <w:sz w:val="19"/>
           <w:szCs w:val="19"/>
         </w:rPr>
-        <w:t xml:space="preserve">Table 7. </w:t>
+        <w:t xml:space="preserve">Table 8. </w:t>
       </w:r>
       <w:r>
         <w:rPr>
@@ -6776,11 +7707,11 @@
       <w:pPr>
         <w:pStyle w:val="Heading2"/>
       </w:pPr>
-      <w:bookmarkStart w:name="_Toc54" w:id="54"/>
+      <w:bookmarkStart w:name="_Toc62" w:id="62"/>
       <w:r>
         <w:t xml:space="preserve">7.1 Spectrum file format</w:t>
       </w:r>
-      <w:bookmarkEnd w:id="54"/>
+      <w:bookmarkEnd w:id="62"/>
     </w:p>
     <w:p>
       <w:pPr>
@@ -6826,7 +7757,7 @@
           <w:sz w:val="19"/>
           <w:szCs w:val="19"/>
         </w:rPr>
-        <w:t xml:space="preserve">Table 8. </w:t>
+        <w:t xml:space="preserve">Table 9. </w:t>
       </w:r>
       <w:r>
         <w:rPr>
@@ -7508,11 +8439,11 @@
         <w:pStyle w:val="Heading1"/>
         <w:pageBreakBefore/>
       </w:pPr>
-      <w:bookmarkStart w:name="_Toc55" w:id="55"/>
+      <w:bookmarkStart w:name="_Toc63" w:id="63"/>
       <w:r>
         <w:t xml:space="preserve">8. Temperature sweep</w:t>
       </w:r>
-      <w:bookmarkEnd w:id="55"/>
+      <w:bookmarkEnd w:id="63"/>
     </w:p>
     <w:p>
       <w:pPr>
@@ -7851,11 +8782,11 @@
         <w:pStyle w:val="Heading1"/>
         <w:pageBreakBefore/>
       </w:pPr>
-      <w:bookmarkStart w:name="_Toc56" w:id="56"/>
+      <w:bookmarkStart w:name="_Toc64" w:id="64"/>
       <w:r>
         <w:t xml:space="preserve">9. Fitting an observed spectrum</w:t>
       </w:r>
-      <w:bookmarkEnd w:id="56"/>
+      <w:bookmarkEnd w:id="64"/>
     </w:p>
     <w:p>
       <w:pPr>
@@ -7938,11 +8869,11 @@
       <w:pPr>
         <w:pStyle w:val="Heading2"/>
       </w:pPr>
-      <w:bookmarkStart w:name="_Toc57" w:id="57"/>
+      <w:bookmarkStart w:name="_Toc65" w:id="65"/>
       <w:r>
         <w:t xml:space="preserve">9.1 Settings</w:t>
       </w:r>
-      <w:bookmarkEnd w:id="57"/>
+      <w:bookmarkEnd w:id="65"/>
     </w:p>
     <w:p>
       <w:pPr>
@@ -7956,7 +8887,7 @@
           <w:sz w:val="19"/>
           <w:szCs w:val="19"/>
         </w:rPr>
-        <w:t xml:space="preserve">Table 9. </w:t>
+        <w:t xml:space="preserve">Table 10. </w:t>
       </w:r>
       <w:r>
         <w:rPr>
@@ -8888,11 +9819,11 @@
       <w:pPr>
         <w:pStyle w:val="Heading2"/>
       </w:pPr>
-      <w:bookmarkStart w:name="_Toc58" w:id="58"/>
+      <w:bookmarkStart w:name="_Toc66" w:id="66"/>
       <w:r>
         <w:t xml:space="preserve">9.2 Search method</w:t>
       </w:r>
-      <w:bookmarkEnd w:id="58"/>
+      <w:bookmarkEnd w:id="66"/>
     </w:p>
     <w:p>
       <w:pPr>
@@ -9162,30 +10093,18 @@
         <w:pStyle w:val="Heading1"/>
         <w:pageBreakBefore/>
       </w:pPr>
-      <w:bookmarkStart w:name="_Toc59" w:id="59"/>
+      <w:bookmarkStart w:name="_Toc67" w:id="67"/>
       <w:r>
         <w:t xml:space="preserve">10. Importing VALD line lists</w:t>
       </w:r>
-      <w:bookmarkEnd w:id="59"/>
+      <w:bookmarkEnd w:id="67"/>
     </w:p>
     <w:p>
       <w:pPr>
         <w:spacing w:after="120"/>
       </w:pPr>
       <w:r>
-        <w:t xml:space="preserve">Tools → Import VALD line list... converts a VALD3 long-format extract (https://www.astro.uu.se/valdwiki/) into a SPRADIAN atomic .dat file in </w:t>
-      </w:r>
-      <w:r>
-        <w:rPr>
-          <w:rFonts w:ascii="Consolas" w:cs="Consolas" w:eastAsia="Consolas" w:hAnsi="Consolas"/>
-          <w:color w:val="7A2E00"/>
-          <w:sz w:val="19"/>
-          <w:szCs w:val="19"/>
-        </w:rPr>
-        <w:t xml:space="preserve">database_debris/</w:t>
-      </w:r>
-      <w:r>
-        <w:t xml:space="preserve">.</w:t>
+        <w:t xml:space="preserve">Tools → Import VALD line list... converts a VALD3 long-format extract (https://www.astro.uu.se/valdwiki/) into a SPRADIAN atomic .dat file in the Debris/Metal folder (Section 2.3).</w:t>
       </w:r>
     </w:p>
     <w:p>
@@ -9193,7 +10112,7 @@
         <w:pStyle w:val="ListParagraph"/>
         <w:numPr>
           <w:ilvl w:val="0"/>
-          <w:numId w:val="5"/>
+          <w:numId w:val="7"/>
         </w:numPr>
         <w:spacing w:after="60"/>
       </w:pPr>
@@ -9206,7 +10125,7 @@
         <w:pStyle w:val="ListParagraph"/>
         <w:numPr>
           <w:ilvl w:val="0"/>
-          <w:numId w:val="5"/>
+          <w:numId w:val="7"/>
         </w:numPr>
         <w:spacing w:after="60"/>
       </w:pPr>
@@ -9219,7 +10138,7 @@
         <w:pStyle w:val="ListParagraph"/>
         <w:numPr>
           <w:ilvl w:val="0"/>
-          <w:numId w:val="5"/>
+          <w:numId w:val="7"/>
         </w:numPr>
         <w:spacing w:after="60"/>
       </w:pPr>
@@ -9232,7 +10151,7 @@
         <w:pStyle w:val="ListParagraph"/>
         <w:numPr>
           <w:ilvl w:val="0"/>
-          <w:numId w:val="5"/>
+          <w:numId w:val="7"/>
         </w:numPr>
         <w:spacing w:after="60"/>
       </w:pPr>
@@ -9318,11 +10237,11 @@
         <w:pStyle w:val="Heading1"/>
         <w:pageBreakBefore/>
       </w:pPr>
-      <w:bookmarkStart w:name="_Toc60" w:id="60"/>
+      <w:bookmarkStart w:name="_Toc68" w:id="68"/>
       <w:r>
         <w:t xml:space="preserve">11. Loading control files (.ctl)</w:t>
       </w:r>
-      <w:bookmarkEnd w:id="60"/>
+      <w:bookmarkEnd w:id="68"/>
     </w:p>
     <w:p>
       <w:pPr>
@@ -9344,7 +10263,7 @@
           <w:sz w:val="19"/>
           <w:szCs w:val="19"/>
         </w:rPr>
-        <w:t xml:space="preserve">Table 10. </w:t>
+        <w:t xml:space="preserve">Table 11. </w:t>
       </w:r>
       <w:r>
         <w:rPr>
@@ -9770,11 +10689,11 @@
         <w:pStyle w:val="Heading1"/>
         <w:pageBreakBefore/>
       </w:pPr>
-      <w:bookmarkStart w:name="_Toc61" w:id="61"/>
+      <w:bookmarkStart w:name="_Toc69" w:id="69"/>
       <w:r>
         <w:t xml:space="preserve">12. Python API</w:t>
       </w:r>
-      <w:bookmarkEnd w:id="61"/>
+      <w:bookmarkEnd w:id="69"/>
     </w:p>
     <w:p>
       <w:pPr>
@@ -10018,7 +10937,7 @@
           <w:sz w:val="19"/>
           <w:szCs w:val="19"/>
         </w:rPr>
-        <w:t xml:space="preserve">Table 11. </w:t>
+        <w:t xml:space="preserve">Table 12. </w:t>
       </w:r>
       <w:r>
         <w:rPr>
@@ -10606,21 +11525,21 @@
         <w:pStyle w:val="Heading1"/>
         <w:pageBreakBefore/>
       </w:pPr>
-      <w:bookmarkStart w:name="_Toc62" w:id="62"/>
+      <w:bookmarkStart w:name="_Toc70" w:id="70"/>
       <w:r>
         <w:t xml:space="preserve">13. Physical model and specifications</w:t>
       </w:r>
-      <w:bookmarkEnd w:id="62"/>
+      <w:bookmarkEnd w:id="70"/>
     </w:p>
     <w:p>
       <w:pPr>
         <w:pStyle w:val="Heading2"/>
       </w:pPr>
-      <w:bookmarkStart w:name="_Toc63" w:id="63"/>
+      <w:bookmarkStart w:name="_Toc71" w:id="71"/>
       <w:r>
         <w:t xml:space="preserve">13.1 Units and conventions</w:t>
       </w:r>
-      <w:bookmarkEnd w:id="63"/>
+      <w:bookmarkEnd w:id="71"/>
     </w:p>
     <w:p>
       <w:pPr>
@@ -10634,7 +11553,7 @@
           <w:sz w:val="19"/>
           <w:szCs w:val="19"/>
         </w:rPr>
-        <w:t xml:space="preserve">Table 12. </w:t>
+        <w:t xml:space="preserve">Table 13. </w:t>
       </w:r>
       <w:r>
         <w:rPr>
@@ -11146,11 +12065,11 @@
       <w:pPr>
         <w:pStyle w:val="Heading2"/>
       </w:pPr>
-      <w:bookmarkStart w:name="_Toc64" w:id="64"/>
+      <w:bookmarkStart w:name="_Toc72" w:id="72"/>
       <w:r>
         <w:t xml:space="preserve">13.2 Calculation flow</w:t>
       </w:r>
-      <w:bookmarkEnd w:id="64"/>
+      <w:bookmarkEnd w:id="72"/>
     </w:p>
     <w:p>
       <w:pPr>
@@ -11194,11 +12113,11 @@
       <w:pPr>
         <w:pStyle w:val="Heading2"/>
       </w:pPr>
-      <w:bookmarkStart w:name="_Toc65" w:id="65"/>
+      <w:bookmarkStart w:name="_Toc73" w:id="73"/>
       <w:r>
         <w:t xml:space="preserve">13.3 Line shapes</w:t>
       </w:r>
-      <w:bookmarkEnd w:id="65"/>
+      <w:bookmarkEnd w:id="73"/>
     </w:p>
     <w:p>
       <w:pPr>
@@ -11257,11 +12176,11 @@
       <w:pPr>
         <w:pStyle w:val="Heading2"/>
       </w:pPr>
-      <w:bookmarkStart w:name="_Toc66" w:id="66"/>
+      <w:bookmarkStart w:name="_Toc74" w:id="74"/>
       <w:r>
         <w:t xml:space="preserve">13.4 Instrument-function convolution</w:t>
       </w:r>
-      <w:bookmarkEnd w:id="66"/>
+      <w:bookmarkEnd w:id="74"/>
     </w:p>
     <w:p>
       <w:pPr>
@@ -11276,11 +12195,11 @@
         <w:pStyle w:val="Heading1"/>
         <w:pageBreakBefore/>
       </w:pPr>
-      <w:bookmarkStart w:name="_Toc67" w:id="67"/>
+      <w:bookmarkStart w:name="_Toc75" w:id="75"/>
       <w:r>
         <w:t xml:space="preserve">14. Databases</w:t>
       </w:r>
-      <w:bookmarkEnd w:id="67"/>
+      <w:bookmarkEnd w:id="75"/>
     </w:p>
     <w:p>
       <w:pPr>
@@ -11294,7 +12213,7 @@
           <w:sz w:val="19"/>
           <w:szCs w:val="19"/>
         </w:rPr>
-        <w:t xml:space="preserve">Table 13. </w:t>
+        <w:t xml:space="preserve">Table 14. </w:t>
       </w:r>
       <w:r>
         <w:rPr>
@@ -11611,11 +12530,11 @@
       <w:pPr>
         <w:pStyle w:val="Heading2"/>
       </w:pPr>
-      <w:bookmarkStart w:name="_Toc68" w:id="68"/>
+      <w:bookmarkStart w:name="_Toc76" w:id="76"/>
       <w:r>
         <w:t xml:space="preserve">14.1 Approximations for the added molecules</w:t>
       </w:r>
-      <w:bookmarkEnd w:id="68"/>
+      <w:bookmarkEnd w:id="76"/>
     </w:p>
     <w:p>
       <w:pPr>
@@ -11709,7 +12628,7 @@
           <w:sz w:val="19"/>
           <w:szCs w:val="19"/>
         </w:rPr>
-        <w:t xml:space="preserve">Table 14. </w:t>
+        <w:t xml:space="preserve">Table 15. </w:t>
       </w:r>
       <w:r>
         <w:rPr>
@@ -12724,11 +13643,11 @@
       <w:pPr>
         <w:pStyle w:val="Heading2"/>
       </w:pPr>
-      <w:bookmarkStart w:name="_Toc69" w:id="69"/>
+      <w:bookmarkStart w:name="_Toc77" w:id="77"/>
       <w:r>
         <w:t xml:space="preserve">14.2 Adding species</w:t>
       </w:r>
-      <w:bookmarkEnd w:id="69"/>
+      <w:bookmarkEnd w:id="77"/>
     </w:p>
     <w:p>
       <w:pPr>
@@ -12810,11 +13729,11 @@
         <w:pStyle w:val="Heading1"/>
         <w:pageBreakBefore/>
       </w:pPr>
-      <w:bookmarkStart w:name="_Toc70" w:id="70"/>
+      <w:bookmarkStart w:name="_Toc78" w:id="78"/>
       <w:r>
         <w:t xml:space="preserve">15. Limitations and cautions</w:t>
       </w:r>
-      <w:bookmarkEnd w:id="70"/>
+      <w:bookmarkEnd w:id="78"/>
     </w:p>
     <w:p>
       <w:pPr>
@@ -12899,11 +13818,11 @@
         <w:pStyle w:val="Heading1"/>
         <w:pageBreakBefore/>
       </w:pPr>
-      <w:bookmarkStart w:name="_Toc71" w:id="71"/>
+      <w:bookmarkStart w:name="_Toc79" w:id="79"/>
       <w:r>
         <w:t xml:space="preserve">16. Credits and references</w:t>
       </w:r>
-      <w:bookmarkEnd w:id="71"/>
+      <w:bookmarkEnd w:id="79"/>
     </w:p>
     <w:p>
       <w:pPr>
@@ -12917,11 +13836,11 @@
       <w:pPr>
         <w:pStyle w:val="Heading2"/>
       </w:pPr>
-      <w:bookmarkStart w:name="_Toc72" w:id="72"/>
+      <w:bookmarkStart w:name="_Toc80" w:id="80"/>
       <w:r>
         <w:t xml:space="preserve">16.1 Required citations</w:t>
       </w:r>
-      <w:bookmarkEnd w:id="72"/>
+      <w:bookmarkEnd w:id="80"/>
     </w:p>
     <w:p>
       <w:pPr>
@@ -12936,7 +13855,7 @@
         <w:pStyle w:val="ListParagraph"/>
         <w:numPr>
           <w:ilvl w:val="0"/>
-          <w:numId w:val="6"/>
+          <w:numId w:val="8"/>
         </w:numPr>
         <w:spacing w:after="60"/>
       </w:pPr>
@@ -12949,7 +13868,7 @@
         <w:pStyle w:val="ListParagraph"/>
         <w:numPr>
           <w:ilvl w:val="0"/>
-          <w:numId w:val="6"/>
+          <w:numId w:val="8"/>
         </w:numPr>
         <w:spacing w:after="60"/>
       </w:pPr>
@@ -12962,7 +13881,7 @@
         <w:pStyle w:val="ListParagraph"/>
         <w:numPr>
           <w:ilvl w:val="0"/>
-          <w:numId w:val="6"/>
+          <w:numId w:val="8"/>
         </w:numPr>
         <w:spacing w:after="60"/>
       </w:pPr>
@@ -12982,11 +13901,11 @@
       <w:pPr>
         <w:pStyle w:val="Heading2"/>
       </w:pPr>
-      <w:bookmarkStart w:name="_Toc73" w:id="73"/>
+      <w:bookmarkStart w:name="_Toc81" w:id="81"/>
       <w:r>
         <w:t xml:space="preserve">16.2 Further references</w:t>
       </w:r>
-      <w:bookmarkEnd w:id="73"/>
+      <w:bookmarkEnd w:id="81"/>
     </w:p>
     <w:p>
       <w:pPr>
@@ -13057,11 +13976,11 @@
       <w:pPr>
         <w:pStyle w:val="Heading2"/>
       </w:pPr>
-      <w:bookmarkStart w:name="_Toc74" w:id="74"/>
+      <w:bookmarkStart w:name="_Toc82" w:id="82"/>
       <w:r>
         <w:t xml:space="preserve">16.3 Terms of use</w:t>
       </w:r>
-      <w:bookmarkEnd w:id="74"/>
+      <w:bookmarkEnd w:id="82"/>
     </w:p>
     <w:p>
       <w:pPr>
@@ -13381,6 +14300,30 @@
       </w:pPr>
     </w:lvl>
   </w:abstractNum>
+  <w:abstractNum w:abstractNumId="7" w15:restartNumberingAfterBreak="0">
+    <w:multiLevelType w:val="hybridMultilevel"/>
+    <w:lvl w:ilvl="0" w:tentative="1">
+      <w:start w:val="1"/>
+      <w:numFmt w:val="decimal"/>
+      <w:lvlText w:val="%1."/>
+      <w:lvlJc w:val="left"/>
+      <w:pPr>
+        <w:ind w:left="420" w:hanging="300"/>
+      </w:pPr>
+    </w:lvl>
+  </w:abstractNum>
+  <w:abstractNum w:abstractNumId="8" w15:restartNumberingAfterBreak="0">
+    <w:multiLevelType w:val="hybridMultilevel"/>
+    <w:lvl w:ilvl="0" w:tentative="1">
+      <w:start w:val="1"/>
+      <w:numFmt w:val="decimal"/>
+      <w:lvlText w:val="%1."/>
+      <w:lvlJc w:val="left"/>
+      <w:pPr>
+        <w:ind w:left="420" w:hanging="300"/>
+      </w:pPr>
+    </w:lvl>
+  </w:abstractNum>
   <w:num w:numId="1">
     <w:abstractNumId w:val="1"/>
     <w:lvlOverride w:ilvl="0">
@@ -13416,6 +14359,18 @@
   </w:num>
   <w:num w:numId="6">
     <w:abstractNumId w:val="6"/>
+    <w:lvlOverride w:ilvl="0">
+      <w:startOverride w:val="1"/>
+    </w:lvlOverride>
+  </w:num>
+  <w:num w:numId="7">
+    <w:abstractNumId w:val="7"/>
+    <w:lvlOverride w:ilvl="0">
+      <w:startOverride w:val="1"/>
+    </w:lvlOverride>
+  </w:num>
+  <w:num w:numId="8">
+    <w:abstractNumId w:val="8"/>
     <w:lvlOverride w:ilvl="0">
       <w:startOverride w:val="1"/>
     </w:lvlOverride>

</xml_diff>

<commit_message>
METEORAD version 1.0: update README and manuals
</commit_message>
<xml_diff>
--- a/manual/METEORAD_Manual_en.docx
+++ b/manual/METEORAD_Manual_en.docx
@@ -115,7 +115,7 @@
           <w:sz w:val="24"/>
           <w:szCs w:val="24"/>
         </w:rPr>
-        <w:t xml:space="preserve">Python edition of SPRADIAN-1.8 (JAXA) — GUI version 0.1.0</w:t>
+        <w:t xml:space="preserve">Python edition of SPRADIAN-1.8 (JAXA) — Version 1.0</w:t>
       </w:r>
     </w:p>
     <w:p>
@@ -153,7 +153,7 @@
           <w:sz w:val="22"/>
           <w:szCs w:val="22"/>
         </w:rPr>
-        <w:t xml:space="preserve">Document date: 2026-10-24</w:t>
+        <w:t xml:space="preserve">Document date: 2026-10-30</w:t>
       </w:r>
     </w:p>
     <w:p>

</xml_diff>